<commit_message>
Corregir Psicología a 5 años: PPS y TIF en el 5.º.
El plan de ejemplo etiquetaba erróneamente PPS/TIF como 6.º año.
La carrera dura 5 años; esos espacios integran el ciclo de egreso.

Co-authored-by: Claudio Larrea <claudiomlarrea@users.noreply.github.com>
</commit_message>
<xml_diff>
--- a/sacau/ejemplos/Plan_Psicologia_1098-CS-2013_HORAS.docx
+++ b/sacau/ejemplos/Plan_Psicologia_1098-CS-2013_HORAS.docx
@@ -13,27 +13,17 @@
     <w:p>
       <w:r>
         <w:rPr>
-          <w:b/>
+          <w:sz w:val="20"/>
         </w:rPr>
-        <w:t>Institución: Universidad Católica de Cuyo</w:t>
-        <w:br/>
-      </w:r>
-      <w:r>
-        <w:t>Título: Licenciado/a en Psicología</w:t>
-        <w:br/>
-      </w:r>
-      <w:r>
-        <w:t>Normativa: Resolución Nº 1098-CS-2013</w:t>
-        <w:br/>
-      </w:r>
-      <w:r>
-        <w:t>Formato: plan de estudios en HORAS (listo para cargar en el Convertidor SACAU).</w:t>
-        <w:br/>
+        <w:t>Universidad Católica de Cuyo · Resolución Nº 1098-CS-2013 · Duración: 5 años. Columnas: código, área, asignatura, h teóricas, h prácticas, régimen (A/S), año.</w:t>
       </w:r>
     </w:p>
     <w:p>
       <w:r>
-        <w:t>Columnas: código, área, asignatura, horas teóricas, horas prácticas, h/semana (aprox.), régimen (A/S), año.</w:t>
+        <w:rPr>
+          <w:sz w:val="18"/>
+        </w:rPr>
+        <w:t>La carrera dura 5 años. PPS y TIF integran el 5.º año (ciclo de egreso); no constituyen un 6.º año curricular. Algunas asignaturas de 4.º año marcan horas_estimadas=true porque el OCR del PDF escaneado no permitió leer todas las celdas; se ajustaron para respetar el total anual publicado (750 h).</w:t>
       </w:r>
     </w:p>
     <w:p>
@@ -66,10 +56,6 @@
           </w:tcPr>
           <w:p>
             <w:r>
-              <w:rPr>
-                <w:b/>
-                <w:sz w:val="18"/>
-              </w:rPr>
               <w:t>Código</w:t>
             </w:r>
           </w:p>
@@ -80,10 +66,6 @@
           </w:tcPr>
           <w:p>
             <w:r>
-              <w:rPr>
-                <w:b/>
-                <w:sz w:val="18"/>
-              </w:rPr>
               <w:t>Área</w:t>
             </w:r>
           </w:p>
@@ -94,10 +76,6 @@
           </w:tcPr>
           <w:p>
             <w:r>
-              <w:rPr>
-                <w:b/>
-                <w:sz w:val="18"/>
-              </w:rPr>
               <w:t>Asignatura</w:t>
             </w:r>
           </w:p>
@@ -108,10 +86,6 @@
           </w:tcPr>
           <w:p>
             <w:r>
-              <w:rPr>
-                <w:b/>
-                <w:sz w:val="18"/>
-              </w:rPr>
               <w:t>H. teóricas</w:t>
             </w:r>
           </w:p>
@@ -122,10 +96,6 @@
           </w:tcPr>
           <w:p>
             <w:r>
-              <w:rPr>
-                <w:b/>
-                <w:sz w:val="18"/>
-              </w:rPr>
               <w:t>H. prácticas</w:t>
             </w:r>
           </w:p>
@@ -136,10 +106,6 @@
           </w:tcPr>
           <w:p>
             <w:r>
-              <w:rPr>
-                <w:b/>
-                <w:sz w:val="18"/>
-              </w:rPr>
               <w:t>Régimen</w:t>
             </w:r>
           </w:p>
@@ -150,10 +116,6 @@
           </w:tcPr>
           <w:p>
             <w:r>
-              <w:rPr>
-                <w:b/>
-                <w:sz w:val="18"/>
-              </w:rPr>
               <w:t>Año</w:t>
             </w:r>
           </w:p>
@@ -166,9 +128,6 @@
           </w:tcPr>
           <w:p>
             <w:r>
-              <w:rPr>
-                <w:sz w:val="18"/>
-              </w:rPr>
               <w:t>01</w:t>
             </w:r>
           </w:p>
@@ -179,9 +138,6 @@
           </w:tcPr>
           <w:p>
             <w:r>
-              <w:rPr>
-                <w:sz w:val="18"/>
-              </w:rPr>
               <w:t>FGC</w:t>
             </w:r>
           </w:p>
@@ -192,9 +148,6 @@
           </w:tcPr>
           <w:p>
             <w:r>
-              <w:rPr>
-                <w:sz w:val="18"/>
-              </w:rPr>
               <w:t>Introducción a la Filosofía</w:t>
             </w:r>
           </w:p>
@@ -205,9 +158,6 @@
           </w:tcPr>
           <w:p>
             <w:r>
-              <w:rPr>
-                <w:sz w:val="18"/>
-              </w:rPr>
               <w:t>84</w:t>
             </w:r>
           </w:p>
@@ -218,9 +168,6 @@
           </w:tcPr>
           <w:p>
             <w:r>
-              <w:rPr>
-                <w:sz w:val="18"/>
-              </w:rPr>
               <w:t>0</w:t>
             </w:r>
           </w:p>
@@ -231,9 +178,6 @@
           </w:tcPr>
           <w:p>
             <w:r>
-              <w:rPr>
-                <w:sz w:val="18"/>
-              </w:rPr>
               <w:t>A</w:t>
             </w:r>
           </w:p>
@@ -244,9 +188,6 @@
           </w:tcPr>
           <w:p>
             <w:r>
-              <w:rPr>
-                <w:sz w:val="18"/>
-              </w:rPr>
               <w:t>1</w:t>
             </w:r>
           </w:p>
@@ -259,9 +200,6 @@
           </w:tcPr>
           <w:p>
             <w:r>
-              <w:rPr>
-                <w:sz w:val="18"/>
-              </w:rPr>
               <w:t>02</w:t>
             </w:r>
           </w:p>
@@ -272,9 +210,6 @@
           </w:tcPr>
           <w:p>
             <w:r>
-              <w:rPr>
-                <w:sz w:val="18"/>
-              </w:rPr>
               <w:t>FGC</w:t>
             </w:r>
           </w:p>
@@ -285,9 +220,6 @@
           </w:tcPr>
           <w:p>
             <w:r>
-              <w:rPr>
-                <w:sz w:val="18"/>
-              </w:rPr>
               <w:t>Sociología</w:t>
             </w:r>
           </w:p>
@@ -298,9 +230,6 @@
           </w:tcPr>
           <w:p>
             <w:r>
-              <w:rPr>
-                <w:sz w:val="18"/>
-              </w:rPr>
               <w:t>84</w:t>
             </w:r>
           </w:p>
@@ -311,9 +240,6 @@
           </w:tcPr>
           <w:p>
             <w:r>
-              <w:rPr>
-                <w:sz w:val="18"/>
-              </w:rPr>
               <w:t>0</w:t>
             </w:r>
           </w:p>
@@ -324,9 +250,6 @@
           </w:tcPr>
           <w:p>
             <w:r>
-              <w:rPr>
-                <w:sz w:val="18"/>
-              </w:rPr>
               <w:t>A</w:t>
             </w:r>
           </w:p>
@@ -337,9 +260,6 @@
           </w:tcPr>
           <w:p>
             <w:r>
-              <w:rPr>
-                <w:sz w:val="18"/>
-              </w:rPr>
               <w:t>1</w:t>
             </w:r>
           </w:p>
@@ -352,9 +272,6 @@
           </w:tcPr>
           <w:p>
             <w:r>
-              <w:rPr>
-                <w:sz w:val="18"/>
-              </w:rPr>
               <w:t>03</w:t>
             </w:r>
           </w:p>
@@ -365,9 +282,6 @@
           </w:tcPr>
           <w:p>
             <w:r>
-              <w:rPr>
-                <w:sz w:val="18"/>
-              </w:rPr>
               <w:t>FGC</w:t>
             </w:r>
           </w:p>
@@ -378,9 +292,6 @@
           </w:tcPr>
           <w:p>
             <w:r>
-              <w:rPr>
-                <w:sz w:val="18"/>
-              </w:rPr>
               <w:t>Antropología Cultural</w:t>
             </w:r>
           </w:p>
@@ -391,9 +302,6 @@
           </w:tcPr>
           <w:p>
             <w:r>
-              <w:rPr>
-                <w:sz w:val="18"/>
-              </w:rPr>
               <w:t>84</w:t>
             </w:r>
           </w:p>
@@ -404,9 +312,6 @@
           </w:tcPr>
           <w:p>
             <w:r>
-              <w:rPr>
-                <w:sz w:val="18"/>
-              </w:rPr>
               <w:t>0</w:t>
             </w:r>
           </w:p>
@@ -417,9 +322,6 @@
           </w:tcPr>
           <w:p>
             <w:r>
-              <w:rPr>
-                <w:sz w:val="18"/>
-              </w:rPr>
               <w:t>S</w:t>
             </w:r>
           </w:p>
@@ -430,9 +332,6 @@
           </w:tcPr>
           <w:p>
             <w:r>
-              <w:rPr>
-                <w:sz w:val="18"/>
-              </w:rPr>
               <w:t>1</w:t>
             </w:r>
           </w:p>
@@ -445,9 +344,6 @@
           </w:tcPr>
           <w:p>
             <w:r>
-              <w:rPr>
-                <w:sz w:val="18"/>
-              </w:rPr>
               <w:t>04</w:t>
             </w:r>
           </w:p>
@@ -458,9 +354,6 @@
           </w:tcPr>
           <w:p>
             <w:r>
-              <w:rPr>
-                <w:sz w:val="18"/>
-              </w:rPr>
               <w:t>FB</w:t>
             </w:r>
           </w:p>
@@ -471,9 +364,6 @@
           </w:tcPr>
           <w:p>
             <w:r>
-              <w:rPr>
-                <w:sz w:val="18"/>
-              </w:rPr>
               <w:t>Psicología del Desarrollo I</w:t>
             </w:r>
           </w:p>
@@ -484,9 +374,6 @@
           </w:tcPr>
           <w:p>
             <w:r>
-              <w:rPr>
-                <w:sz w:val="18"/>
-              </w:rPr>
               <w:t>84</w:t>
             </w:r>
           </w:p>
@@ -497,9 +384,6 @@
           </w:tcPr>
           <w:p>
             <w:r>
-              <w:rPr>
-                <w:sz w:val="18"/>
-              </w:rPr>
               <w:t>14</w:t>
             </w:r>
           </w:p>
@@ -510,9 +394,6 @@
           </w:tcPr>
           <w:p>
             <w:r>
-              <w:rPr>
-                <w:sz w:val="18"/>
-              </w:rPr>
               <w:t>A</w:t>
             </w:r>
           </w:p>
@@ -523,9 +404,6 @@
           </w:tcPr>
           <w:p>
             <w:r>
-              <w:rPr>
-                <w:sz w:val="18"/>
-              </w:rPr>
               <w:t>1</w:t>
             </w:r>
           </w:p>
@@ -538,9 +416,6 @@
           </w:tcPr>
           <w:p>
             <w:r>
-              <w:rPr>
-                <w:sz w:val="18"/>
-              </w:rPr>
               <w:t>05</w:t>
             </w:r>
           </w:p>
@@ -551,9 +426,6 @@
           </w:tcPr>
           <w:p>
             <w:r>
-              <w:rPr>
-                <w:sz w:val="18"/>
-              </w:rPr>
               <w:t>FB</w:t>
             </w:r>
           </w:p>
@@ -564,9 +436,6 @@
           </w:tcPr>
           <w:p>
             <w:r>
-              <w:rPr>
-                <w:sz w:val="18"/>
-              </w:rPr>
               <w:t>Historia y Corrientes de la Psicología</w:t>
             </w:r>
           </w:p>
@@ -577,9 +446,6 @@
           </w:tcPr>
           <w:p>
             <w:r>
-              <w:rPr>
-                <w:sz w:val="18"/>
-              </w:rPr>
               <w:t>70</w:t>
             </w:r>
           </w:p>
@@ -590,9 +456,6 @@
           </w:tcPr>
           <w:p>
             <w:r>
-              <w:rPr>
-                <w:sz w:val="18"/>
-              </w:rPr>
               <w:t>0</w:t>
             </w:r>
           </w:p>
@@ -603,9 +466,6 @@
           </w:tcPr>
           <w:p>
             <w:r>
-              <w:rPr>
-                <w:sz w:val="18"/>
-              </w:rPr>
               <w:t>S</w:t>
             </w:r>
           </w:p>
@@ -616,9 +476,6 @@
           </w:tcPr>
           <w:p>
             <w:r>
-              <w:rPr>
-                <w:sz w:val="18"/>
-              </w:rPr>
               <w:t>1</w:t>
             </w:r>
           </w:p>
@@ -631,9 +488,6 @@
           </w:tcPr>
           <w:p>
             <w:r>
-              <w:rPr>
-                <w:sz w:val="18"/>
-              </w:rPr>
               <w:t>06</w:t>
             </w:r>
           </w:p>
@@ -644,9 +498,6 @@
           </w:tcPr>
           <w:p>
             <w:r>
-              <w:rPr>
-                <w:sz w:val="18"/>
-              </w:rPr>
               <w:t>FB</w:t>
             </w:r>
           </w:p>
@@ -657,9 +508,6 @@
           </w:tcPr>
           <w:p>
             <w:r>
-              <w:rPr>
-                <w:sz w:val="18"/>
-              </w:rPr>
               <w:t>Introducción a la Psicología</w:t>
             </w:r>
           </w:p>
@@ -670,9 +518,6 @@
           </w:tcPr>
           <w:p>
             <w:r>
-              <w:rPr>
-                <w:sz w:val="18"/>
-              </w:rPr>
               <w:t>70</w:t>
             </w:r>
           </w:p>
@@ -683,9 +528,6 @@
           </w:tcPr>
           <w:p>
             <w:r>
-              <w:rPr>
-                <w:sz w:val="18"/>
-              </w:rPr>
               <w:t>0</w:t>
             </w:r>
           </w:p>
@@ -696,9 +538,6 @@
           </w:tcPr>
           <w:p>
             <w:r>
-              <w:rPr>
-                <w:sz w:val="18"/>
-              </w:rPr>
               <w:t>S</w:t>
             </w:r>
           </w:p>
@@ -709,9 +548,6 @@
           </w:tcPr>
           <w:p>
             <w:r>
-              <w:rPr>
-                <w:sz w:val="18"/>
-              </w:rPr>
               <w:t>1</w:t>
             </w:r>
           </w:p>
@@ -724,9 +560,6 @@
           </w:tcPr>
           <w:p>
             <w:r>
-              <w:rPr>
-                <w:sz w:val="18"/>
-              </w:rPr>
               <w:t>07</w:t>
             </w:r>
           </w:p>
@@ -737,9 +570,6 @@
           </w:tcPr>
           <w:p>
             <w:r>
-              <w:rPr>
-                <w:sz w:val="18"/>
-              </w:rPr>
               <w:t>FB</w:t>
             </w:r>
           </w:p>
@@ -750,9 +580,6 @@
           </w:tcPr>
           <w:p>
             <w:r>
-              <w:rPr>
-                <w:sz w:val="18"/>
-              </w:rPr>
               <w:t>Teorías de la Personalidad</w:t>
             </w:r>
           </w:p>
@@ -763,9 +590,6 @@
           </w:tcPr>
           <w:p>
             <w:r>
-              <w:rPr>
-                <w:sz w:val="18"/>
-              </w:rPr>
               <w:t>42</w:t>
             </w:r>
           </w:p>
@@ -776,9 +600,6 @@
           </w:tcPr>
           <w:p>
             <w:r>
-              <w:rPr>
-                <w:sz w:val="18"/>
-              </w:rPr>
               <w:t>0</w:t>
             </w:r>
           </w:p>
@@ -789,9 +610,6 @@
           </w:tcPr>
           <w:p>
             <w:r>
-              <w:rPr>
-                <w:sz w:val="18"/>
-              </w:rPr>
               <w:t>S</w:t>
             </w:r>
           </w:p>
@@ -802,9 +620,6 @@
           </w:tcPr>
           <w:p>
             <w:r>
-              <w:rPr>
-                <w:sz w:val="18"/>
-              </w:rPr>
               <w:t>1</w:t>
             </w:r>
           </w:p>
@@ -817,9 +632,6 @@
           </w:tcPr>
           <w:p>
             <w:r>
-              <w:rPr>
-                <w:sz w:val="18"/>
-              </w:rPr>
               <w:t>08</w:t>
             </w:r>
           </w:p>
@@ -830,9 +642,6 @@
           </w:tcPr>
           <w:p>
             <w:r>
-              <w:rPr>
-                <w:sz w:val="18"/>
-              </w:rPr>
               <w:t>FB</w:t>
             </w:r>
           </w:p>
@@ -843,9 +652,6 @@
           </w:tcPr>
           <w:p>
             <w:r>
-              <w:rPr>
-                <w:sz w:val="18"/>
-              </w:rPr>
               <w:t>Lógica y Epistemología</w:t>
             </w:r>
           </w:p>
@@ -856,9 +662,6 @@
           </w:tcPr>
           <w:p>
             <w:r>
-              <w:rPr>
-                <w:sz w:val="18"/>
-              </w:rPr>
               <w:t>56</w:t>
             </w:r>
           </w:p>
@@ -869,9 +672,6 @@
           </w:tcPr>
           <w:p>
             <w:r>
-              <w:rPr>
-                <w:sz w:val="18"/>
-              </w:rPr>
               <w:t>0</w:t>
             </w:r>
           </w:p>
@@ -882,9 +682,6 @@
           </w:tcPr>
           <w:p>
             <w:r>
-              <w:rPr>
-                <w:sz w:val="18"/>
-              </w:rPr>
               <w:t>S</w:t>
             </w:r>
           </w:p>
@@ -895,9 +692,6 @@
           </w:tcPr>
           <w:p>
             <w:r>
-              <w:rPr>
-                <w:sz w:val="18"/>
-              </w:rPr>
               <w:t>1</w:t>
             </w:r>
           </w:p>
@@ -910,9 +704,6 @@
           </w:tcPr>
           <w:p>
             <w:r>
-              <w:rPr>
-                <w:sz w:val="18"/>
-              </w:rPr>
               <w:t>09</w:t>
             </w:r>
           </w:p>
@@ -923,9 +714,6 @@
           </w:tcPr>
           <w:p>
             <w:r>
-              <w:rPr>
-                <w:sz w:val="18"/>
-              </w:rPr>
               <w:t>FB</w:t>
             </w:r>
           </w:p>
@@ -936,9 +724,6 @@
           </w:tcPr>
           <w:p>
             <w:r>
-              <w:rPr>
-                <w:sz w:val="18"/>
-              </w:rPr>
               <w:t>Psicoanálisis</w:t>
             </w:r>
           </w:p>
@@ -949,9 +734,6 @@
           </w:tcPr>
           <w:p>
             <w:r>
-              <w:rPr>
-                <w:sz w:val="18"/>
-              </w:rPr>
               <w:t>84</w:t>
             </w:r>
           </w:p>
@@ -962,9 +744,6 @@
           </w:tcPr>
           <w:p>
             <w:r>
-              <w:rPr>
-                <w:sz w:val="18"/>
-              </w:rPr>
               <w:t>0</w:t>
             </w:r>
           </w:p>
@@ -975,9 +754,6 @@
           </w:tcPr>
           <w:p>
             <w:r>
-              <w:rPr>
-                <w:sz w:val="18"/>
-              </w:rPr>
               <w:t>A</w:t>
             </w:r>
           </w:p>
@@ -988,9 +764,6 @@
           </w:tcPr>
           <w:p>
             <w:r>
-              <w:rPr>
-                <w:sz w:val="18"/>
-              </w:rPr>
               <w:t>1</w:t>
             </w:r>
           </w:p>
@@ -1003,9 +776,6 @@
           </w:tcPr>
           <w:p>
             <w:r>
-              <w:rPr>
-                <w:sz w:val="18"/>
-              </w:rPr>
               <w:t>10</w:t>
             </w:r>
           </w:p>
@@ -1016,9 +786,6 @@
           </w:tcPr>
           <w:p>
             <w:r>
-              <w:rPr>
-                <w:sz w:val="18"/>
-              </w:rPr>
               <w:t>FCI</w:t>
             </w:r>
           </w:p>
@@ -1029,9 +796,6 @@
           </w:tcPr>
           <w:p>
             <w:r>
-              <w:rPr>
-                <w:sz w:val="18"/>
-              </w:rPr>
               <w:t>Seminario de Integración I</w:t>
             </w:r>
           </w:p>
@@ -1042,9 +806,6 @@
           </w:tcPr>
           <w:p>
             <w:r>
-              <w:rPr>
-                <w:sz w:val="18"/>
-              </w:rPr>
               <w:t>28</w:t>
             </w:r>
           </w:p>
@@ -1055,9 +816,6 @@
           </w:tcPr>
           <w:p>
             <w:r>
-              <w:rPr>
-                <w:sz w:val="18"/>
-              </w:rPr>
               <w:t>0</w:t>
             </w:r>
           </w:p>
@@ -1068,9 +826,6 @@
           </w:tcPr>
           <w:p>
             <w:r>
-              <w:rPr>
-                <w:sz w:val="18"/>
-              </w:rPr>
               <w:t>S</w:t>
             </w:r>
           </w:p>
@@ -1081,9 +836,6 @@
           </w:tcPr>
           <w:p>
             <w:r>
-              <w:rPr>
-                <w:sz w:val="18"/>
-              </w:rPr>
               <w:t>1</w:t>
             </w:r>
           </w:p>
@@ -1125,10 +877,6 @@
           </w:tcPr>
           <w:p>
             <w:r>
-              <w:rPr>
-                <w:b/>
-                <w:sz w:val="18"/>
-              </w:rPr>
               <w:t>Código</w:t>
             </w:r>
           </w:p>
@@ -1139,10 +887,6 @@
           </w:tcPr>
           <w:p>
             <w:r>
-              <w:rPr>
-                <w:b/>
-                <w:sz w:val="18"/>
-              </w:rPr>
               <w:t>Área</w:t>
             </w:r>
           </w:p>
@@ -1153,10 +897,6 @@
           </w:tcPr>
           <w:p>
             <w:r>
-              <w:rPr>
-                <w:b/>
-                <w:sz w:val="18"/>
-              </w:rPr>
               <w:t>Asignatura</w:t>
             </w:r>
           </w:p>
@@ -1167,10 +907,6 @@
           </w:tcPr>
           <w:p>
             <w:r>
-              <w:rPr>
-                <w:b/>
-                <w:sz w:val="18"/>
-              </w:rPr>
               <w:t>H. teóricas</w:t>
             </w:r>
           </w:p>
@@ -1181,10 +917,6 @@
           </w:tcPr>
           <w:p>
             <w:r>
-              <w:rPr>
-                <w:b/>
-                <w:sz w:val="18"/>
-              </w:rPr>
               <w:t>H. prácticas</w:t>
             </w:r>
           </w:p>
@@ -1195,10 +927,6 @@
           </w:tcPr>
           <w:p>
             <w:r>
-              <w:rPr>
-                <w:b/>
-                <w:sz w:val="18"/>
-              </w:rPr>
               <w:t>Régimen</w:t>
             </w:r>
           </w:p>
@@ -1209,10 +937,6 @@
           </w:tcPr>
           <w:p>
             <w:r>
-              <w:rPr>
-                <w:b/>
-                <w:sz w:val="18"/>
-              </w:rPr>
               <w:t>Año</w:t>
             </w:r>
           </w:p>
@@ -1225,9 +949,6 @@
           </w:tcPr>
           <w:p>
             <w:r>
-              <w:rPr>
-                <w:sz w:val="18"/>
-              </w:rPr>
               <w:t>11</w:t>
             </w:r>
           </w:p>
@@ -1238,9 +959,6 @@
           </w:tcPr>
           <w:p>
             <w:r>
-              <w:rPr>
-                <w:sz w:val="18"/>
-              </w:rPr>
               <w:t>FGC</w:t>
             </w:r>
           </w:p>
@@ -1251,9 +969,6 @@
           </w:tcPr>
           <w:p>
             <w:r>
-              <w:rPr>
-                <w:sz w:val="18"/>
-              </w:rPr>
               <w:t>Antropología Filosófica</w:t>
             </w:r>
           </w:p>
@@ -1264,9 +979,6 @@
           </w:tcPr>
           <w:p>
             <w:r>
-              <w:rPr>
-                <w:sz w:val="18"/>
-              </w:rPr>
               <w:t>70</w:t>
             </w:r>
           </w:p>
@@ -1277,9 +989,6 @@
           </w:tcPr>
           <w:p>
             <w:r>
-              <w:rPr>
-                <w:sz w:val="18"/>
-              </w:rPr>
               <w:t>0</w:t>
             </w:r>
           </w:p>
@@ -1290,9 +999,6 @@
           </w:tcPr>
           <w:p>
             <w:r>
-              <w:rPr>
-                <w:sz w:val="18"/>
-              </w:rPr>
               <w:t>A</w:t>
             </w:r>
           </w:p>
@@ -1303,9 +1009,6 @@
           </w:tcPr>
           <w:p>
             <w:r>
-              <w:rPr>
-                <w:sz w:val="18"/>
-              </w:rPr>
               <w:t>2</w:t>
             </w:r>
           </w:p>
@@ -1318,9 +1021,6 @@
           </w:tcPr>
           <w:p>
             <w:r>
-              <w:rPr>
-                <w:sz w:val="18"/>
-              </w:rPr>
               <w:t>12</w:t>
             </w:r>
           </w:p>
@@ -1331,9 +1031,6 @@
           </w:tcPr>
           <w:p>
             <w:r>
-              <w:rPr>
-                <w:sz w:val="18"/>
-              </w:rPr>
               <w:t>FB</w:t>
             </w:r>
           </w:p>
@@ -1344,9 +1041,6 @@
           </w:tcPr>
           <w:p>
             <w:r>
-              <w:rPr>
-                <w:sz w:val="18"/>
-              </w:rPr>
               <w:t>Bases Neurobiológicas</w:t>
             </w:r>
           </w:p>
@@ -1357,9 +1051,6 @@
           </w:tcPr>
           <w:p>
             <w:r>
-              <w:rPr>
-                <w:sz w:val="18"/>
-              </w:rPr>
               <w:t>112</w:t>
             </w:r>
           </w:p>
@@ -1370,9 +1061,6 @@
           </w:tcPr>
           <w:p>
             <w:r>
-              <w:rPr>
-                <w:sz w:val="18"/>
-              </w:rPr>
               <w:t>0</w:t>
             </w:r>
           </w:p>
@@ -1383,9 +1071,6 @@
           </w:tcPr>
           <w:p>
             <w:r>
-              <w:rPr>
-                <w:sz w:val="18"/>
-              </w:rPr>
               <w:t>A</w:t>
             </w:r>
           </w:p>
@@ -1396,9 +1081,6 @@
           </w:tcPr>
           <w:p>
             <w:r>
-              <w:rPr>
-                <w:sz w:val="18"/>
-              </w:rPr>
               <w:t>2</w:t>
             </w:r>
           </w:p>
@@ -1411,9 +1093,6 @@
           </w:tcPr>
           <w:p>
             <w:r>
-              <w:rPr>
-                <w:sz w:val="18"/>
-              </w:rPr>
               <w:t>13</w:t>
             </w:r>
           </w:p>
@@ -1424,9 +1103,6 @@
           </w:tcPr>
           <w:p>
             <w:r>
-              <w:rPr>
-                <w:sz w:val="18"/>
-              </w:rPr>
               <w:t>FB</w:t>
             </w:r>
           </w:p>
@@ -1437,9 +1113,6 @@
           </w:tcPr>
           <w:p>
             <w:r>
-              <w:rPr>
-                <w:sz w:val="18"/>
-              </w:rPr>
               <w:t>Psicología del Desarrollo II</w:t>
             </w:r>
           </w:p>
@@ -1450,9 +1123,6 @@
           </w:tcPr>
           <w:p>
             <w:r>
-              <w:rPr>
-                <w:sz w:val="18"/>
-              </w:rPr>
               <w:t>84</w:t>
             </w:r>
           </w:p>
@@ -1463,9 +1133,6 @@
           </w:tcPr>
           <w:p>
             <w:r>
-              <w:rPr>
-                <w:sz w:val="18"/>
-              </w:rPr>
               <w:t>14</w:t>
             </w:r>
           </w:p>
@@ -1476,9 +1143,6 @@
           </w:tcPr>
           <w:p>
             <w:r>
-              <w:rPr>
-                <w:sz w:val="18"/>
-              </w:rPr>
               <w:t>A</w:t>
             </w:r>
           </w:p>
@@ -1489,9 +1153,6 @@
           </w:tcPr>
           <w:p>
             <w:r>
-              <w:rPr>
-                <w:sz w:val="18"/>
-              </w:rPr>
               <w:t>2</w:t>
             </w:r>
           </w:p>
@@ -1504,9 +1165,6 @@
           </w:tcPr>
           <w:p>
             <w:r>
-              <w:rPr>
-                <w:sz w:val="18"/>
-              </w:rPr>
               <w:t>14</w:t>
             </w:r>
           </w:p>
@@ -1517,9 +1175,6 @@
           </w:tcPr>
           <w:p>
             <w:r>
-              <w:rPr>
-                <w:sz w:val="18"/>
-              </w:rPr>
               <w:t>FB</w:t>
             </w:r>
           </w:p>
@@ -1530,9 +1185,6 @@
           </w:tcPr>
           <w:p>
             <w:r>
-              <w:rPr>
-                <w:sz w:val="18"/>
-              </w:rPr>
               <w:t>Metodología de la Investigación I</w:t>
             </w:r>
           </w:p>
@@ -1543,9 +1195,6 @@
           </w:tcPr>
           <w:p>
             <w:r>
-              <w:rPr>
-                <w:sz w:val="18"/>
-              </w:rPr>
               <w:t>56</w:t>
             </w:r>
           </w:p>
@@ -1556,9 +1205,6 @@
           </w:tcPr>
           <w:p>
             <w:r>
-              <w:rPr>
-                <w:sz w:val="18"/>
-              </w:rPr>
               <w:t>14</w:t>
             </w:r>
           </w:p>
@@ -1569,9 +1215,6 @@
           </w:tcPr>
           <w:p>
             <w:r>
-              <w:rPr>
-                <w:sz w:val="18"/>
-              </w:rPr>
               <w:t>S</w:t>
             </w:r>
           </w:p>
@@ -1582,9 +1225,6 @@
           </w:tcPr>
           <w:p>
             <w:r>
-              <w:rPr>
-                <w:sz w:val="18"/>
-              </w:rPr>
               <w:t>2</w:t>
             </w:r>
           </w:p>
@@ -1597,9 +1237,6 @@
           </w:tcPr>
           <w:p>
             <w:r>
-              <w:rPr>
-                <w:sz w:val="18"/>
-              </w:rPr>
               <w:t>15</w:t>
             </w:r>
           </w:p>
@@ -1610,9 +1247,6 @@
           </w:tcPr>
           <w:p>
             <w:r>
-              <w:rPr>
-                <w:sz w:val="18"/>
-              </w:rPr>
               <w:t>FP</w:t>
             </w:r>
           </w:p>
@@ -1623,9 +1257,6 @@
           </w:tcPr>
           <w:p>
             <w:r>
-              <w:rPr>
-                <w:sz w:val="18"/>
-              </w:rPr>
               <w:t>Introducción a la Psicopatología</w:t>
             </w:r>
           </w:p>
@@ -1636,9 +1267,6 @@
           </w:tcPr>
           <w:p>
             <w:r>
-              <w:rPr>
-                <w:sz w:val="18"/>
-              </w:rPr>
               <w:t>60</w:t>
             </w:r>
           </w:p>
@@ -1649,9 +1277,6 @@
           </w:tcPr>
           <w:p>
             <w:r>
-              <w:rPr>
-                <w:sz w:val="18"/>
-              </w:rPr>
               <w:t>10</w:t>
             </w:r>
           </w:p>
@@ -1662,9 +1287,6 @@
           </w:tcPr>
           <w:p>
             <w:r>
-              <w:rPr>
-                <w:sz w:val="18"/>
-              </w:rPr>
               <w:t>S</w:t>
             </w:r>
           </w:p>
@@ -1675,9 +1297,6 @@
           </w:tcPr>
           <w:p>
             <w:r>
-              <w:rPr>
-                <w:sz w:val="18"/>
-              </w:rPr>
               <w:t>2</w:t>
             </w:r>
           </w:p>
@@ -1690,9 +1309,6 @@
           </w:tcPr>
           <w:p>
             <w:r>
-              <w:rPr>
-                <w:sz w:val="18"/>
-              </w:rPr>
               <w:t>16</w:t>
             </w:r>
           </w:p>
@@ -1703,9 +1319,6 @@
           </w:tcPr>
           <w:p>
             <w:r>
-              <w:rPr>
-                <w:sz w:val="18"/>
-              </w:rPr>
               <w:t>FP</w:t>
             </w:r>
           </w:p>
@@ -1716,9 +1329,6 @@
           </w:tcPr>
           <w:p>
             <w:r>
-              <w:rPr>
-                <w:sz w:val="18"/>
-              </w:rPr>
               <w:t>Teoría y Abordaje Gestáltico</w:t>
             </w:r>
           </w:p>
@@ -1729,9 +1339,6 @@
           </w:tcPr>
           <w:p>
             <w:r>
-              <w:rPr>
-                <w:sz w:val="18"/>
-              </w:rPr>
               <w:t>76</w:t>
             </w:r>
           </w:p>
@@ -1742,9 +1349,6 @@
           </w:tcPr>
           <w:p>
             <w:r>
-              <w:rPr>
-                <w:sz w:val="18"/>
-              </w:rPr>
               <w:t>10</w:t>
             </w:r>
           </w:p>
@@ -1755,9 +1359,6 @@
           </w:tcPr>
           <w:p>
             <w:r>
-              <w:rPr>
-                <w:sz w:val="18"/>
-              </w:rPr>
               <w:t>S</w:t>
             </w:r>
           </w:p>
@@ -1768,9 +1369,6 @@
           </w:tcPr>
           <w:p>
             <w:r>
-              <w:rPr>
-                <w:sz w:val="18"/>
-              </w:rPr>
               <w:t>2</w:t>
             </w:r>
           </w:p>
@@ -1783,9 +1381,6 @@
           </w:tcPr>
           <w:p>
             <w:r>
-              <w:rPr>
-                <w:sz w:val="18"/>
-              </w:rPr>
               <w:t>17</w:t>
             </w:r>
           </w:p>
@@ -1796,9 +1391,6 @@
           </w:tcPr>
           <w:p>
             <w:r>
-              <w:rPr>
-                <w:sz w:val="18"/>
-              </w:rPr>
               <w:t>FP</w:t>
             </w:r>
           </w:p>
@@ -1809,9 +1401,6 @@
           </w:tcPr>
           <w:p>
             <w:r>
-              <w:rPr>
-                <w:sz w:val="18"/>
-              </w:rPr>
               <w:t>Teoría y Abordaje Cognitivo-conductual</w:t>
             </w:r>
           </w:p>
@@ -1822,9 +1411,6 @@
           </w:tcPr>
           <w:p>
             <w:r>
-              <w:rPr>
-                <w:sz w:val="18"/>
-              </w:rPr>
               <w:t>76</w:t>
             </w:r>
           </w:p>
@@ -1835,9 +1421,6 @@
           </w:tcPr>
           <w:p>
             <w:r>
-              <w:rPr>
-                <w:sz w:val="18"/>
-              </w:rPr>
               <w:t>10</w:t>
             </w:r>
           </w:p>
@@ -1848,9 +1431,6 @@
           </w:tcPr>
           <w:p>
             <w:r>
-              <w:rPr>
-                <w:sz w:val="18"/>
-              </w:rPr>
               <w:t>S</w:t>
             </w:r>
           </w:p>
@@ -1861,9 +1441,6 @@
           </w:tcPr>
           <w:p>
             <w:r>
-              <w:rPr>
-                <w:sz w:val="18"/>
-              </w:rPr>
               <w:t>2</w:t>
             </w:r>
           </w:p>
@@ -1876,9 +1453,6 @@
           </w:tcPr>
           <w:p>
             <w:r>
-              <w:rPr>
-                <w:sz w:val="18"/>
-              </w:rPr>
               <w:t>18</w:t>
             </w:r>
           </w:p>
@@ -1889,9 +1463,6 @@
           </w:tcPr>
           <w:p>
             <w:r>
-              <w:rPr>
-                <w:sz w:val="18"/>
-              </w:rPr>
               <w:t>FP</w:t>
             </w:r>
           </w:p>
@@ -1902,9 +1473,6 @@
           </w:tcPr>
           <w:p>
             <w:r>
-              <w:rPr>
-                <w:sz w:val="18"/>
-              </w:rPr>
               <w:t>Teoría y Abordaje de la Logoterapia</w:t>
             </w:r>
           </w:p>
@@ -1915,9 +1483,6 @@
           </w:tcPr>
           <w:p>
             <w:r>
-              <w:rPr>
-                <w:sz w:val="18"/>
-              </w:rPr>
               <w:t>76</w:t>
             </w:r>
           </w:p>
@@ -1928,9 +1493,6 @@
           </w:tcPr>
           <w:p>
             <w:r>
-              <w:rPr>
-                <w:sz w:val="18"/>
-              </w:rPr>
               <w:t>10</w:t>
             </w:r>
           </w:p>
@@ -1941,9 +1503,6 @@
           </w:tcPr>
           <w:p>
             <w:r>
-              <w:rPr>
-                <w:sz w:val="18"/>
-              </w:rPr>
               <w:t>S</w:t>
             </w:r>
           </w:p>
@@ -1954,9 +1513,6 @@
           </w:tcPr>
           <w:p>
             <w:r>
-              <w:rPr>
-                <w:sz w:val="18"/>
-              </w:rPr>
               <w:t>2</w:t>
             </w:r>
           </w:p>
@@ -1969,9 +1525,6 @@
           </w:tcPr>
           <w:p>
             <w:r>
-              <w:rPr>
-                <w:sz w:val="18"/>
-              </w:rPr>
               <w:t>19</w:t>
             </w:r>
           </w:p>
@@ -1982,9 +1535,6 @@
           </w:tcPr>
           <w:p>
             <w:r>
-              <w:rPr>
-                <w:sz w:val="18"/>
-              </w:rPr>
               <w:t>FCI</w:t>
             </w:r>
           </w:p>
@@ -1995,9 +1545,6 @@
           </w:tcPr>
           <w:p>
             <w:r>
-              <w:rPr>
-                <w:sz w:val="18"/>
-              </w:rPr>
               <w:t>Seminario de Integración II</w:t>
             </w:r>
           </w:p>
@@ -2008,9 +1555,6 @@
           </w:tcPr>
           <w:p>
             <w:r>
-              <w:rPr>
-                <w:sz w:val="18"/>
-              </w:rPr>
               <w:t>28</w:t>
             </w:r>
           </w:p>
@@ -2021,9 +1565,6 @@
           </w:tcPr>
           <w:p>
             <w:r>
-              <w:rPr>
-                <w:sz w:val="18"/>
-              </w:rPr>
               <w:t>0</w:t>
             </w:r>
           </w:p>
@@ -2034,9 +1575,6 @@
           </w:tcPr>
           <w:p>
             <w:r>
-              <w:rPr>
-                <w:sz w:val="18"/>
-              </w:rPr>
               <w:t>S</w:t>
             </w:r>
           </w:p>
@@ -2047,9 +1585,6 @@
           </w:tcPr>
           <w:p>
             <w:r>
-              <w:rPr>
-                <w:sz w:val="18"/>
-              </w:rPr>
               <w:t>2</w:t>
             </w:r>
           </w:p>
@@ -2062,9 +1597,6 @@
           </w:tcPr>
           <w:p>
             <w:r>
-              <w:rPr>
-                <w:sz w:val="18"/>
-              </w:rPr>
               <w:t>20</w:t>
             </w:r>
           </w:p>
@@ -2075,9 +1607,6 @@
           </w:tcPr>
           <w:p>
             <w:r>
-              <w:rPr>
-                <w:sz w:val="18"/>
-              </w:rPr>
               <w:t>FCI</w:t>
             </w:r>
           </w:p>
@@ -2088,9 +1617,6 @@
           </w:tcPr>
           <w:p>
             <w:r>
-              <w:rPr>
-                <w:sz w:val="18"/>
-              </w:rPr>
               <w:t>Teología I</w:t>
             </w:r>
           </w:p>
@@ -2101,9 +1627,6 @@
           </w:tcPr>
           <w:p>
             <w:r>
-              <w:rPr>
-                <w:sz w:val="18"/>
-              </w:rPr>
               <w:t>42</w:t>
             </w:r>
           </w:p>
@@ -2114,9 +1637,6 @@
           </w:tcPr>
           <w:p>
             <w:r>
-              <w:rPr>
-                <w:sz w:val="18"/>
-              </w:rPr>
               <w:t>0</w:t>
             </w:r>
           </w:p>
@@ -2127,9 +1647,6 @@
           </w:tcPr>
           <w:p>
             <w:r>
-              <w:rPr>
-                <w:sz w:val="18"/>
-              </w:rPr>
               <w:t>S</w:t>
             </w:r>
           </w:p>
@@ -2140,9 +1657,6 @@
           </w:tcPr>
           <w:p>
             <w:r>
-              <w:rPr>
-                <w:sz w:val="18"/>
-              </w:rPr>
               <w:t>2</w:t>
             </w:r>
           </w:p>
@@ -2184,10 +1698,6 @@
           </w:tcPr>
           <w:p>
             <w:r>
-              <w:rPr>
-                <w:b/>
-                <w:sz w:val="18"/>
-              </w:rPr>
               <w:t>Código</w:t>
             </w:r>
           </w:p>
@@ -2198,10 +1708,6 @@
           </w:tcPr>
           <w:p>
             <w:r>
-              <w:rPr>
-                <w:b/>
-                <w:sz w:val="18"/>
-              </w:rPr>
               <w:t>Área</w:t>
             </w:r>
           </w:p>
@@ -2212,10 +1718,6 @@
           </w:tcPr>
           <w:p>
             <w:r>
-              <w:rPr>
-                <w:b/>
-                <w:sz w:val="18"/>
-              </w:rPr>
               <w:t>Asignatura</w:t>
             </w:r>
           </w:p>
@@ -2226,10 +1728,6 @@
           </w:tcPr>
           <w:p>
             <w:r>
-              <w:rPr>
-                <w:b/>
-                <w:sz w:val="18"/>
-              </w:rPr>
               <w:t>H. teóricas</w:t>
             </w:r>
           </w:p>
@@ -2240,10 +1738,6 @@
           </w:tcPr>
           <w:p>
             <w:r>
-              <w:rPr>
-                <w:b/>
-                <w:sz w:val="18"/>
-              </w:rPr>
               <w:t>H. prácticas</w:t>
             </w:r>
           </w:p>
@@ -2254,10 +1748,6 @@
           </w:tcPr>
           <w:p>
             <w:r>
-              <w:rPr>
-                <w:b/>
-                <w:sz w:val="18"/>
-              </w:rPr>
               <w:t>Régimen</w:t>
             </w:r>
           </w:p>
@@ -2268,10 +1758,6 @@
           </w:tcPr>
           <w:p>
             <w:r>
-              <w:rPr>
-                <w:b/>
-                <w:sz w:val="18"/>
-              </w:rPr>
               <w:t>Año</w:t>
             </w:r>
           </w:p>
@@ -2284,9 +1770,6 @@
           </w:tcPr>
           <w:p>
             <w:r>
-              <w:rPr>
-                <w:sz w:val="18"/>
-              </w:rPr>
               <w:t>21</w:t>
             </w:r>
           </w:p>
@@ -2297,9 +1780,6 @@
           </w:tcPr>
           <w:p>
             <w:r>
-              <w:rPr>
-                <w:sz w:val="18"/>
-              </w:rPr>
               <w:t>FGC</w:t>
             </w:r>
           </w:p>
@@ -2310,9 +1790,6 @@
           </w:tcPr>
           <w:p>
             <w:r>
-              <w:rPr>
-                <w:sz w:val="18"/>
-              </w:rPr>
               <w:t>Sistemas Sociales</w:t>
             </w:r>
           </w:p>
@@ -2323,9 +1800,6 @@
           </w:tcPr>
           <w:p>
             <w:r>
-              <w:rPr>
-                <w:sz w:val="18"/>
-              </w:rPr>
               <w:t>84</w:t>
             </w:r>
           </w:p>
@@ -2336,9 +1810,6 @@
           </w:tcPr>
           <w:p>
             <w:r>
-              <w:rPr>
-                <w:sz w:val="18"/>
-              </w:rPr>
               <w:t>0</w:t>
             </w:r>
           </w:p>
@@ -2349,9 +1820,6 @@
           </w:tcPr>
           <w:p>
             <w:r>
-              <w:rPr>
-                <w:sz w:val="18"/>
-              </w:rPr>
               <w:t>S</w:t>
             </w:r>
           </w:p>
@@ -2362,9 +1830,6 @@
           </w:tcPr>
           <w:p>
             <w:r>
-              <w:rPr>
-                <w:sz w:val="18"/>
-              </w:rPr>
               <w:t>3</w:t>
             </w:r>
           </w:p>
@@ -2377,9 +1842,6 @@
           </w:tcPr>
           <w:p>
             <w:r>
-              <w:rPr>
-                <w:sz w:val="18"/>
-              </w:rPr>
               <w:t>22</w:t>
             </w:r>
           </w:p>
@@ -2390,9 +1852,6 @@
           </w:tcPr>
           <w:p>
             <w:r>
-              <w:rPr>
-                <w:sz w:val="18"/>
-              </w:rPr>
               <w:t>FB</w:t>
             </w:r>
           </w:p>
@@ -2403,9 +1862,6 @@
           </w:tcPr>
           <w:p>
             <w:r>
-              <w:rPr>
-                <w:sz w:val="18"/>
-              </w:rPr>
               <w:t>Psicología del Desarrollo III</w:t>
             </w:r>
           </w:p>
@@ -2416,9 +1872,6 @@
           </w:tcPr>
           <w:p>
             <w:r>
-              <w:rPr>
-                <w:sz w:val="18"/>
-              </w:rPr>
               <w:t>84</w:t>
             </w:r>
           </w:p>
@@ -2429,9 +1882,6 @@
           </w:tcPr>
           <w:p>
             <w:r>
-              <w:rPr>
-                <w:sz w:val="18"/>
-              </w:rPr>
               <w:t>14</w:t>
             </w:r>
           </w:p>
@@ -2442,9 +1892,6 @@
           </w:tcPr>
           <w:p>
             <w:r>
-              <w:rPr>
-                <w:sz w:val="18"/>
-              </w:rPr>
               <w:t>A</w:t>
             </w:r>
           </w:p>
@@ -2455,9 +1902,6 @@
           </w:tcPr>
           <w:p>
             <w:r>
-              <w:rPr>
-                <w:sz w:val="18"/>
-              </w:rPr>
               <w:t>3</w:t>
             </w:r>
           </w:p>
@@ -2470,9 +1914,6 @@
           </w:tcPr>
           <w:p>
             <w:r>
-              <w:rPr>
-                <w:sz w:val="18"/>
-              </w:rPr>
               <w:t>23</w:t>
             </w:r>
           </w:p>
@@ -2483,9 +1924,6 @@
           </w:tcPr>
           <w:p>
             <w:r>
-              <w:rPr>
-                <w:sz w:val="18"/>
-              </w:rPr>
               <w:t>FB</w:t>
             </w:r>
           </w:p>
@@ -2496,9 +1934,6 @@
           </w:tcPr>
           <w:p>
             <w:r>
-              <w:rPr>
-                <w:sz w:val="18"/>
-              </w:rPr>
               <w:t>Neuropsicología</w:t>
             </w:r>
           </w:p>
@@ -2509,9 +1944,6 @@
           </w:tcPr>
           <w:p>
             <w:r>
-              <w:rPr>
-                <w:sz w:val="18"/>
-              </w:rPr>
               <w:t>42</w:t>
             </w:r>
           </w:p>
@@ -2522,9 +1954,6 @@
           </w:tcPr>
           <w:p>
             <w:r>
-              <w:rPr>
-                <w:sz w:val="18"/>
-              </w:rPr>
               <w:t>0</w:t>
             </w:r>
           </w:p>
@@ -2535,9 +1964,6 @@
           </w:tcPr>
           <w:p>
             <w:r>
-              <w:rPr>
-                <w:sz w:val="18"/>
-              </w:rPr>
               <w:t>S</w:t>
             </w:r>
           </w:p>
@@ -2548,9 +1974,6 @@
           </w:tcPr>
           <w:p>
             <w:r>
-              <w:rPr>
-                <w:sz w:val="18"/>
-              </w:rPr>
               <w:t>3</w:t>
             </w:r>
           </w:p>
@@ -2563,9 +1986,6 @@
           </w:tcPr>
           <w:p>
             <w:r>
-              <w:rPr>
-                <w:sz w:val="18"/>
-              </w:rPr>
               <w:t>24</w:t>
             </w:r>
           </w:p>
@@ -2576,9 +1996,6 @@
           </w:tcPr>
           <w:p>
             <w:r>
-              <w:rPr>
-                <w:sz w:val="18"/>
-              </w:rPr>
               <w:t>FB</w:t>
             </w:r>
           </w:p>
@@ -2589,9 +2006,6 @@
           </w:tcPr>
           <w:p>
             <w:r>
-              <w:rPr>
-                <w:sz w:val="18"/>
-              </w:rPr>
               <w:t>Metodología de la Investigación II</w:t>
             </w:r>
           </w:p>
@@ -2602,9 +2016,6 @@
           </w:tcPr>
           <w:p>
             <w:r>
-              <w:rPr>
-                <w:sz w:val="18"/>
-              </w:rPr>
               <w:t>56</w:t>
             </w:r>
           </w:p>
@@ -2615,9 +2026,6 @@
           </w:tcPr>
           <w:p>
             <w:r>
-              <w:rPr>
-                <w:sz w:val="18"/>
-              </w:rPr>
               <w:t>14</w:t>
             </w:r>
           </w:p>
@@ -2628,9 +2036,6 @@
           </w:tcPr>
           <w:p>
             <w:r>
-              <w:rPr>
-                <w:sz w:val="18"/>
-              </w:rPr>
               <w:t>S</w:t>
             </w:r>
           </w:p>
@@ -2641,9 +2046,6 @@
           </w:tcPr>
           <w:p>
             <w:r>
-              <w:rPr>
-                <w:sz w:val="18"/>
-              </w:rPr>
               <w:t>3</w:t>
             </w:r>
           </w:p>
@@ -2656,9 +2058,6 @@
           </w:tcPr>
           <w:p>
             <w:r>
-              <w:rPr>
-                <w:sz w:val="18"/>
-              </w:rPr>
               <w:t>25</w:t>
             </w:r>
           </w:p>
@@ -2669,9 +2068,6 @@
           </w:tcPr>
           <w:p>
             <w:r>
-              <w:rPr>
-                <w:sz w:val="18"/>
-              </w:rPr>
               <w:t>FB</w:t>
             </w:r>
           </w:p>
@@ -2682,9 +2078,6 @@
           </w:tcPr>
           <w:p>
             <w:r>
-              <w:rPr>
-                <w:sz w:val="18"/>
-              </w:rPr>
               <w:t>Psicoestadística</w:t>
             </w:r>
           </w:p>
@@ -2695,9 +2088,6 @@
           </w:tcPr>
           <w:p>
             <w:r>
-              <w:rPr>
-                <w:sz w:val="18"/>
-              </w:rPr>
               <w:t>42</w:t>
             </w:r>
           </w:p>
@@ -2708,9 +2098,6 @@
           </w:tcPr>
           <w:p>
             <w:r>
-              <w:rPr>
-                <w:sz w:val="18"/>
-              </w:rPr>
               <w:t>0</w:t>
             </w:r>
           </w:p>
@@ -2721,9 +2108,6 @@
           </w:tcPr>
           <w:p>
             <w:r>
-              <w:rPr>
-                <w:sz w:val="18"/>
-              </w:rPr>
               <w:t>S</w:t>
             </w:r>
           </w:p>
@@ -2734,9 +2118,6 @@
           </w:tcPr>
           <w:p>
             <w:r>
-              <w:rPr>
-                <w:sz w:val="18"/>
-              </w:rPr>
               <w:t>3</w:t>
             </w:r>
           </w:p>
@@ -2749,9 +2130,6 @@
           </w:tcPr>
           <w:p>
             <w:r>
-              <w:rPr>
-                <w:sz w:val="18"/>
-              </w:rPr>
               <w:t>26</w:t>
             </w:r>
           </w:p>
@@ -2762,9 +2140,6 @@
           </w:tcPr>
           <w:p>
             <w:r>
-              <w:rPr>
-                <w:sz w:val="18"/>
-              </w:rPr>
               <w:t>FP</w:t>
             </w:r>
           </w:p>
@@ -2775,9 +2150,6 @@
           </w:tcPr>
           <w:p>
             <w:r>
-              <w:rPr>
-                <w:sz w:val="18"/>
-              </w:rPr>
               <w:t>Psicopatología del Adulto y Geronte</w:t>
             </w:r>
           </w:p>
@@ -2788,9 +2160,6 @@
           </w:tcPr>
           <w:p>
             <w:r>
-              <w:rPr>
-                <w:sz w:val="18"/>
-              </w:rPr>
               <w:t>98</w:t>
             </w:r>
           </w:p>
@@ -2801,9 +2170,6 @@
           </w:tcPr>
           <w:p>
             <w:r>
-              <w:rPr>
-                <w:sz w:val="18"/>
-              </w:rPr>
               <w:t>14</w:t>
             </w:r>
           </w:p>
@@ -2814,9 +2180,6 @@
           </w:tcPr>
           <w:p>
             <w:r>
-              <w:rPr>
-                <w:sz w:val="18"/>
-              </w:rPr>
               <w:t>A</w:t>
             </w:r>
           </w:p>
@@ -2827,9 +2190,6 @@
           </w:tcPr>
           <w:p>
             <w:r>
-              <w:rPr>
-                <w:sz w:val="18"/>
-              </w:rPr>
               <w:t>3</w:t>
             </w:r>
           </w:p>
@@ -2842,9 +2202,6 @@
           </w:tcPr>
           <w:p>
             <w:r>
-              <w:rPr>
-                <w:sz w:val="18"/>
-              </w:rPr>
               <w:t>27</w:t>
             </w:r>
           </w:p>
@@ -2855,9 +2212,6 @@
           </w:tcPr>
           <w:p>
             <w:r>
-              <w:rPr>
-                <w:sz w:val="18"/>
-              </w:rPr>
               <w:t>FP</w:t>
             </w:r>
           </w:p>
@@ -2868,9 +2222,6 @@
           </w:tcPr>
           <w:p>
             <w:r>
-              <w:rPr>
-                <w:sz w:val="18"/>
-              </w:rPr>
               <w:t>Técnicas de Exploración Psicológica I</w:t>
             </w:r>
           </w:p>
@@ -2881,9 +2232,6 @@
           </w:tcPr>
           <w:p>
             <w:r>
-              <w:rPr>
-                <w:sz w:val="18"/>
-              </w:rPr>
               <w:t>94</w:t>
             </w:r>
           </w:p>
@@ -2894,9 +2242,6 @@
           </w:tcPr>
           <w:p>
             <w:r>
-              <w:rPr>
-                <w:sz w:val="18"/>
-              </w:rPr>
               <w:t>18</w:t>
             </w:r>
           </w:p>
@@ -2907,9 +2252,6 @@
           </w:tcPr>
           <w:p>
             <w:r>
-              <w:rPr>
-                <w:sz w:val="18"/>
-              </w:rPr>
               <w:t>A</w:t>
             </w:r>
           </w:p>
@@ -2920,9 +2262,6 @@
           </w:tcPr>
           <w:p>
             <w:r>
-              <w:rPr>
-                <w:sz w:val="18"/>
-              </w:rPr>
               <w:t>3</w:t>
             </w:r>
           </w:p>
@@ -2935,9 +2274,6 @@
           </w:tcPr>
           <w:p>
             <w:r>
-              <w:rPr>
-                <w:sz w:val="18"/>
-              </w:rPr>
               <w:t>28</w:t>
             </w:r>
           </w:p>
@@ -2948,9 +2284,6 @@
           </w:tcPr>
           <w:p>
             <w:r>
-              <w:rPr>
-                <w:sz w:val="18"/>
-              </w:rPr>
               <w:t>FP</w:t>
             </w:r>
           </w:p>
@@ -2961,9 +2294,6 @@
           </w:tcPr>
           <w:p>
             <w:r>
-              <w:rPr>
-                <w:sz w:val="18"/>
-              </w:rPr>
               <w:t>Teoría y Abordaje Sistémico</w:t>
             </w:r>
           </w:p>
@@ -2974,9 +2304,6 @@
           </w:tcPr>
           <w:p>
             <w:r>
-              <w:rPr>
-                <w:sz w:val="18"/>
-              </w:rPr>
               <w:t>76</w:t>
             </w:r>
           </w:p>
@@ -2987,9 +2314,6 @@
           </w:tcPr>
           <w:p>
             <w:r>
-              <w:rPr>
-                <w:sz w:val="18"/>
-              </w:rPr>
               <w:t>10</w:t>
             </w:r>
           </w:p>
@@ -3000,9 +2324,6 @@
           </w:tcPr>
           <w:p>
             <w:r>
-              <w:rPr>
-                <w:sz w:val="18"/>
-              </w:rPr>
               <w:t>S</w:t>
             </w:r>
           </w:p>
@@ -3013,9 +2334,6 @@
           </w:tcPr>
           <w:p>
             <w:r>
-              <w:rPr>
-                <w:sz w:val="18"/>
-              </w:rPr>
               <w:t>3</w:t>
             </w:r>
           </w:p>
@@ -3028,9 +2346,6 @@
           </w:tcPr>
           <w:p>
             <w:r>
-              <w:rPr>
-                <w:sz w:val="18"/>
-              </w:rPr>
               <w:t>29</w:t>
             </w:r>
           </w:p>
@@ -3041,9 +2356,6 @@
           </w:tcPr>
           <w:p>
             <w:r>
-              <w:rPr>
-                <w:sz w:val="18"/>
-              </w:rPr>
               <w:t>FCI</w:t>
             </w:r>
           </w:p>
@@ -3054,9 +2366,6 @@
           </w:tcPr>
           <w:p>
             <w:r>
-              <w:rPr>
-                <w:sz w:val="18"/>
-              </w:rPr>
               <w:t>Optativa I</w:t>
             </w:r>
           </w:p>
@@ -3067,9 +2376,6 @@
           </w:tcPr>
           <w:p>
             <w:r>
-              <w:rPr>
-                <w:sz w:val="18"/>
-              </w:rPr>
               <w:t>36</w:t>
             </w:r>
           </w:p>
@@ -3080,9 +2386,6 @@
           </w:tcPr>
           <w:p>
             <w:r>
-              <w:rPr>
-                <w:sz w:val="18"/>
-              </w:rPr>
               <w:t>0</w:t>
             </w:r>
           </w:p>
@@ -3093,9 +2396,6 @@
           </w:tcPr>
           <w:p>
             <w:r>
-              <w:rPr>
-                <w:sz w:val="18"/>
-              </w:rPr>
               <w:t>S</w:t>
             </w:r>
           </w:p>
@@ -3106,9 +2406,6 @@
           </w:tcPr>
           <w:p>
             <w:r>
-              <w:rPr>
-                <w:sz w:val="18"/>
-              </w:rPr>
               <w:t>3</w:t>
             </w:r>
           </w:p>
@@ -3121,9 +2418,6 @@
           </w:tcPr>
           <w:p>
             <w:r>
-              <w:rPr>
-                <w:sz w:val="18"/>
-              </w:rPr>
               <w:t>30</w:t>
             </w:r>
           </w:p>
@@ -3134,9 +2428,6 @@
           </w:tcPr>
           <w:p>
             <w:r>
-              <w:rPr>
-                <w:sz w:val="18"/>
-              </w:rPr>
               <w:t>FCI</w:t>
             </w:r>
           </w:p>
@@ -3147,9 +2438,6 @@
           </w:tcPr>
           <w:p>
             <w:r>
-              <w:rPr>
-                <w:sz w:val="18"/>
-              </w:rPr>
               <w:t>Taller de Reflexión I</w:t>
             </w:r>
           </w:p>
@@ -3160,9 +2448,6 @@
           </w:tcPr>
           <w:p>
             <w:r>
-              <w:rPr>
-                <w:sz w:val="18"/>
-              </w:rPr>
               <w:t>28</w:t>
             </w:r>
           </w:p>
@@ -3173,9 +2458,6 @@
           </w:tcPr>
           <w:p>
             <w:r>
-              <w:rPr>
-                <w:sz w:val="18"/>
-              </w:rPr>
               <w:t>0</w:t>
             </w:r>
           </w:p>
@@ -3186,9 +2468,6 @@
           </w:tcPr>
           <w:p>
             <w:r>
-              <w:rPr>
-                <w:sz w:val="18"/>
-              </w:rPr>
               <w:t>S</w:t>
             </w:r>
           </w:p>
@@ -3199,9 +2478,6 @@
           </w:tcPr>
           <w:p>
             <w:r>
-              <w:rPr>
-                <w:sz w:val="18"/>
-              </w:rPr>
               <w:t>3</w:t>
             </w:r>
           </w:p>
@@ -3214,9 +2490,6 @@
           </w:tcPr>
           <w:p>
             <w:r>
-              <w:rPr>
-                <w:sz w:val="18"/>
-              </w:rPr>
               <w:t>31</w:t>
             </w:r>
           </w:p>
@@ -3227,9 +2500,6 @@
           </w:tcPr>
           <w:p>
             <w:r>
-              <w:rPr>
-                <w:sz w:val="18"/>
-              </w:rPr>
               <w:t>FCI</w:t>
             </w:r>
           </w:p>
@@ -3240,9 +2510,6 @@
           </w:tcPr>
           <w:p>
             <w:r>
-              <w:rPr>
-                <w:sz w:val="18"/>
-              </w:rPr>
               <w:t>Teología II</w:t>
             </w:r>
           </w:p>
@@ -3253,9 +2520,6 @@
           </w:tcPr>
           <w:p>
             <w:r>
-              <w:rPr>
-                <w:sz w:val="18"/>
-              </w:rPr>
               <w:t>42</w:t>
             </w:r>
           </w:p>
@@ -3266,9 +2530,6 @@
           </w:tcPr>
           <w:p>
             <w:r>
-              <w:rPr>
-                <w:sz w:val="18"/>
-              </w:rPr>
               <w:t>0</w:t>
             </w:r>
           </w:p>
@@ -3279,9 +2540,6 @@
           </w:tcPr>
           <w:p>
             <w:r>
-              <w:rPr>
-                <w:sz w:val="18"/>
-              </w:rPr>
               <w:t>S</w:t>
             </w:r>
           </w:p>
@@ -3292,9 +2550,6 @@
           </w:tcPr>
           <w:p>
             <w:r>
-              <w:rPr>
-                <w:sz w:val="18"/>
-              </w:rPr>
               <w:t>3</w:t>
             </w:r>
           </w:p>
@@ -3336,10 +2591,6 @@
           </w:tcPr>
           <w:p>
             <w:r>
-              <w:rPr>
-                <w:b/>
-                <w:sz w:val="18"/>
-              </w:rPr>
               <w:t>Código</w:t>
             </w:r>
           </w:p>
@@ -3350,10 +2601,6 @@
           </w:tcPr>
           <w:p>
             <w:r>
-              <w:rPr>
-                <w:b/>
-                <w:sz w:val="18"/>
-              </w:rPr>
               <w:t>Área</w:t>
             </w:r>
           </w:p>
@@ -3364,10 +2611,6 @@
           </w:tcPr>
           <w:p>
             <w:r>
-              <w:rPr>
-                <w:b/>
-                <w:sz w:val="18"/>
-              </w:rPr>
               <w:t>Asignatura</w:t>
             </w:r>
           </w:p>
@@ -3378,10 +2621,6 @@
           </w:tcPr>
           <w:p>
             <w:r>
-              <w:rPr>
-                <w:b/>
-                <w:sz w:val="18"/>
-              </w:rPr>
               <w:t>H. teóricas</w:t>
             </w:r>
           </w:p>
@@ -3392,10 +2631,6 @@
           </w:tcPr>
           <w:p>
             <w:r>
-              <w:rPr>
-                <w:b/>
-                <w:sz w:val="18"/>
-              </w:rPr>
               <w:t>H. prácticas</w:t>
             </w:r>
           </w:p>
@@ -3406,10 +2641,6 @@
           </w:tcPr>
           <w:p>
             <w:r>
-              <w:rPr>
-                <w:b/>
-                <w:sz w:val="18"/>
-              </w:rPr>
               <w:t>Régimen</w:t>
             </w:r>
           </w:p>
@@ -3420,10 +2651,6 @@
           </w:tcPr>
           <w:p>
             <w:r>
-              <w:rPr>
-                <w:b/>
-                <w:sz w:val="18"/>
-              </w:rPr>
               <w:t>Año</w:t>
             </w:r>
           </w:p>
@@ -3436,9 +2663,6 @@
           </w:tcPr>
           <w:p>
             <w:r>
-              <w:rPr>
-                <w:sz w:val="18"/>
-              </w:rPr>
               <w:t>32</w:t>
             </w:r>
           </w:p>
@@ -3449,9 +2673,6 @@
           </w:tcPr>
           <w:p>
             <w:r>
-              <w:rPr>
-                <w:sz w:val="18"/>
-              </w:rPr>
               <w:t>FGC</w:t>
             </w:r>
           </w:p>
@@ -3462,9 +2683,6 @@
           </w:tcPr>
           <w:p>
             <w:r>
-              <w:rPr>
-                <w:sz w:val="18"/>
-              </w:rPr>
               <w:t>Discusión Filosófica de los Paradigmas Psicológicos</w:t>
             </w:r>
           </w:p>
@@ -3475,9 +2693,6 @@
           </w:tcPr>
           <w:p>
             <w:r>
-              <w:rPr>
-                <w:sz w:val="18"/>
-              </w:rPr>
               <w:t>70</w:t>
             </w:r>
           </w:p>
@@ -3488,9 +2703,6 @@
           </w:tcPr>
           <w:p>
             <w:r>
-              <w:rPr>
-                <w:sz w:val="18"/>
-              </w:rPr>
               <w:t>0</w:t>
             </w:r>
           </w:p>
@@ -3501,9 +2713,6 @@
           </w:tcPr>
           <w:p>
             <w:r>
-              <w:rPr>
-                <w:sz w:val="18"/>
-              </w:rPr>
               <w:t>A</w:t>
             </w:r>
           </w:p>
@@ -3514,9 +2723,6 @@
           </w:tcPr>
           <w:p>
             <w:r>
-              <w:rPr>
-                <w:sz w:val="18"/>
-              </w:rPr>
               <w:t>4</w:t>
             </w:r>
           </w:p>
@@ -3529,9 +2735,6 @@
           </w:tcPr>
           <w:p>
             <w:r>
-              <w:rPr>
-                <w:sz w:val="18"/>
-              </w:rPr>
               <w:t>33</w:t>
             </w:r>
           </w:p>
@@ -3542,9 +2745,6 @@
           </w:tcPr>
           <w:p>
             <w:r>
-              <w:rPr>
-                <w:sz w:val="18"/>
-              </w:rPr>
               <w:t>FB</w:t>
             </w:r>
           </w:p>
@@ -3555,9 +2755,6 @@
           </w:tcPr>
           <w:p>
             <w:r>
-              <w:rPr>
-                <w:sz w:val="18"/>
-              </w:rPr>
               <w:t>Psicofarmacología</w:t>
             </w:r>
           </w:p>
@@ -3568,9 +2765,6 @@
           </w:tcPr>
           <w:p>
             <w:r>
-              <w:rPr>
-                <w:sz w:val="18"/>
-              </w:rPr>
               <w:t>42</w:t>
             </w:r>
           </w:p>
@@ -3581,9 +2775,6 @@
           </w:tcPr>
           <w:p>
             <w:r>
-              <w:rPr>
-                <w:sz w:val="18"/>
-              </w:rPr>
               <w:t>0</w:t>
             </w:r>
           </w:p>
@@ -3594,9 +2785,6 @@
           </w:tcPr>
           <w:p>
             <w:r>
-              <w:rPr>
-                <w:sz w:val="18"/>
-              </w:rPr>
               <w:t>S</w:t>
             </w:r>
           </w:p>
@@ -3607,9 +2795,6 @@
           </w:tcPr>
           <w:p>
             <w:r>
-              <w:rPr>
-                <w:sz w:val="18"/>
-              </w:rPr>
               <w:t>4</w:t>
             </w:r>
           </w:p>
@@ -3622,9 +2807,6 @@
           </w:tcPr>
           <w:p>
             <w:r>
-              <w:rPr>
-                <w:sz w:val="18"/>
-              </w:rPr>
               <w:t>34</w:t>
             </w:r>
           </w:p>
@@ -3635,9 +2817,6 @@
           </w:tcPr>
           <w:p>
             <w:r>
-              <w:rPr>
-                <w:sz w:val="18"/>
-              </w:rPr>
               <w:t>FP</w:t>
             </w:r>
           </w:p>
@@ -3648,9 +2827,6 @@
           </w:tcPr>
           <w:p>
             <w:r>
-              <w:rPr>
-                <w:sz w:val="18"/>
-              </w:rPr>
               <w:t>Técnicas de Exploración Psicológica II</w:t>
             </w:r>
           </w:p>
@@ -3661,9 +2837,6 @@
           </w:tcPr>
           <w:p>
             <w:r>
-              <w:rPr>
-                <w:sz w:val="18"/>
-              </w:rPr>
               <w:t>94</w:t>
             </w:r>
           </w:p>
@@ -3674,9 +2847,6 @@
           </w:tcPr>
           <w:p>
             <w:r>
-              <w:rPr>
-                <w:sz w:val="18"/>
-              </w:rPr>
               <w:t>18</w:t>
             </w:r>
           </w:p>
@@ -3687,9 +2857,6 @@
           </w:tcPr>
           <w:p>
             <w:r>
-              <w:rPr>
-                <w:sz w:val="18"/>
-              </w:rPr>
               <w:t>A</w:t>
             </w:r>
           </w:p>
@@ -3700,9 +2867,6 @@
           </w:tcPr>
           <w:p>
             <w:r>
-              <w:rPr>
-                <w:sz w:val="18"/>
-              </w:rPr>
               <w:t>4</w:t>
             </w:r>
           </w:p>
@@ -3715,9 +2879,6 @@
           </w:tcPr>
           <w:p>
             <w:r>
-              <w:rPr>
-                <w:sz w:val="18"/>
-              </w:rPr>
               <w:t>35</w:t>
             </w:r>
           </w:p>
@@ -3728,9 +2889,6 @@
           </w:tcPr>
           <w:p>
             <w:r>
-              <w:rPr>
-                <w:sz w:val="18"/>
-              </w:rPr>
               <w:t>FP</w:t>
             </w:r>
           </w:p>
@@ -3741,9 +2899,6 @@
           </w:tcPr>
           <w:p>
             <w:r>
-              <w:rPr>
-                <w:sz w:val="18"/>
-              </w:rPr>
               <w:t>Psicopatología Infanto-Juvenil</w:t>
             </w:r>
           </w:p>
@@ -3754,9 +2909,6 @@
           </w:tcPr>
           <w:p>
             <w:r>
-              <w:rPr>
-                <w:sz w:val="18"/>
-              </w:rPr>
               <w:t>84</w:t>
             </w:r>
           </w:p>
@@ -3767,9 +2919,6 @@
           </w:tcPr>
           <w:p>
             <w:r>
-              <w:rPr>
-                <w:sz w:val="18"/>
-              </w:rPr>
               <w:t>14</w:t>
             </w:r>
           </w:p>
@@ -3780,9 +2929,6 @@
           </w:tcPr>
           <w:p>
             <w:r>
-              <w:rPr>
-                <w:sz w:val="18"/>
-              </w:rPr>
               <w:t>A</w:t>
             </w:r>
           </w:p>
@@ -3793,9 +2939,6 @@
           </w:tcPr>
           <w:p>
             <w:r>
-              <w:rPr>
-                <w:sz w:val="18"/>
-              </w:rPr>
               <w:t>4</w:t>
             </w:r>
           </w:p>
@@ -3808,9 +2951,6 @@
           </w:tcPr>
           <w:p>
             <w:r>
-              <w:rPr>
-                <w:sz w:val="18"/>
-              </w:rPr>
               <w:t>36</w:t>
             </w:r>
           </w:p>
@@ -3821,9 +2961,6 @@
           </w:tcPr>
           <w:p>
             <w:r>
-              <w:rPr>
-                <w:sz w:val="18"/>
-              </w:rPr>
               <w:t>FP</w:t>
             </w:r>
           </w:p>
@@ -3834,9 +2971,6 @@
           </w:tcPr>
           <w:p>
             <w:r>
-              <w:rPr>
-                <w:sz w:val="18"/>
-              </w:rPr>
               <w:t>Psicología Educacional</w:t>
             </w:r>
           </w:p>
@@ -3847,9 +2981,6 @@
           </w:tcPr>
           <w:p>
             <w:r>
-              <w:rPr>
-                <w:sz w:val="18"/>
-              </w:rPr>
               <w:t>74</w:t>
             </w:r>
           </w:p>
@@ -3860,9 +2991,6 @@
           </w:tcPr>
           <w:p>
             <w:r>
-              <w:rPr>
-                <w:sz w:val="18"/>
-              </w:rPr>
               <w:t>10</w:t>
             </w:r>
           </w:p>
@@ -3873,9 +3001,6 @@
           </w:tcPr>
           <w:p>
             <w:r>
-              <w:rPr>
-                <w:sz w:val="18"/>
-              </w:rPr>
               <w:t>S</w:t>
             </w:r>
           </w:p>
@@ -3886,9 +3011,6 @@
           </w:tcPr>
           <w:p>
             <w:r>
-              <w:rPr>
-                <w:sz w:val="18"/>
-              </w:rPr>
               <w:t>4</w:t>
             </w:r>
           </w:p>
@@ -3901,9 +3023,6 @@
           </w:tcPr>
           <w:p>
             <w:r>
-              <w:rPr>
-                <w:sz w:val="18"/>
-              </w:rPr>
               <w:t>37</w:t>
             </w:r>
           </w:p>
@@ -3914,9 +3033,6 @@
           </w:tcPr>
           <w:p>
             <w:r>
-              <w:rPr>
-                <w:sz w:val="18"/>
-              </w:rPr>
               <w:t>FP</w:t>
             </w:r>
           </w:p>
@@ -3927,9 +3043,6 @@
           </w:tcPr>
           <w:p>
             <w:r>
-              <w:rPr>
-                <w:sz w:val="18"/>
-              </w:rPr>
               <w:t>Psicología Social y Comunitaria</w:t>
             </w:r>
           </w:p>
@@ -3940,9 +3053,6 @@
           </w:tcPr>
           <w:p>
             <w:r>
-              <w:rPr>
-                <w:sz w:val="18"/>
-              </w:rPr>
               <w:t>74</w:t>
             </w:r>
           </w:p>
@@ -3953,9 +3063,6 @@
           </w:tcPr>
           <w:p>
             <w:r>
-              <w:rPr>
-                <w:sz w:val="18"/>
-              </w:rPr>
               <w:t>10</w:t>
             </w:r>
           </w:p>
@@ -3966,9 +3073,6 @@
           </w:tcPr>
           <w:p>
             <w:r>
-              <w:rPr>
-                <w:sz w:val="18"/>
-              </w:rPr>
               <w:t>S</w:t>
             </w:r>
           </w:p>
@@ -3979,9 +3083,6 @@
           </w:tcPr>
           <w:p>
             <w:r>
-              <w:rPr>
-                <w:sz w:val="18"/>
-              </w:rPr>
               <w:t>4</w:t>
             </w:r>
           </w:p>
@@ -3994,9 +3095,6 @@
           </w:tcPr>
           <w:p>
             <w:r>
-              <w:rPr>
-                <w:sz w:val="18"/>
-              </w:rPr>
               <w:t>38</w:t>
             </w:r>
           </w:p>
@@ -4007,9 +3105,6 @@
           </w:tcPr>
           <w:p>
             <w:r>
-              <w:rPr>
-                <w:sz w:val="18"/>
-              </w:rPr>
               <w:t>FP</w:t>
             </w:r>
           </w:p>
@@ -4020,9 +3115,6 @@
           </w:tcPr>
           <w:p>
             <w:r>
-              <w:rPr>
-                <w:sz w:val="18"/>
-              </w:rPr>
               <w:t>Abordaje Psicoanalítico del Adulto</w:t>
             </w:r>
           </w:p>
@@ -4033,9 +3125,6 @@
           </w:tcPr>
           <w:p>
             <w:r>
-              <w:rPr>
-                <w:sz w:val="18"/>
-              </w:rPr>
               <w:t>62</w:t>
             </w:r>
           </w:p>
@@ -4046,9 +3135,6 @@
           </w:tcPr>
           <w:p>
             <w:r>
-              <w:rPr>
-                <w:sz w:val="18"/>
-              </w:rPr>
               <w:t>8</w:t>
             </w:r>
           </w:p>
@@ -4059,9 +3145,6 @@
           </w:tcPr>
           <w:p>
             <w:r>
-              <w:rPr>
-                <w:sz w:val="18"/>
-              </w:rPr>
               <w:t>S</w:t>
             </w:r>
           </w:p>
@@ -4072,9 +3155,6 @@
           </w:tcPr>
           <w:p>
             <w:r>
-              <w:rPr>
-                <w:sz w:val="18"/>
-              </w:rPr>
               <w:t>4</w:t>
             </w:r>
           </w:p>
@@ -4087,9 +3167,6 @@
           </w:tcPr>
           <w:p>
             <w:r>
-              <w:rPr>
-                <w:sz w:val="18"/>
-              </w:rPr>
               <w:t>39</w:t>
             </w:r>
           </w:p>
@@ -4100,9 +3177,6 @@
           </w:tcPr>
           <w:p>
             <w:r>
-              <w:rPr>
-                <w:sz w:val="18"/>
-              </w:rPr>
               <w:t>FP</w:t>
             </w:r>
           </w:p>
@@ -4113,9 +3187,6 @@
           </w:tcPr>
           <w:p>
             <w:r>
-              <w:rPr>
-                <w:sz w:val="18"/>
-              </w:rPr>
               <w:t>Abordaje Psicoanalítico Infanto-Juvenil</w:t>
             </w:r>
           </w:p>
@@ -4126,9 +3197,6 @@
           </w:tcPr>
           <w:p>
             <w:r>
-              <w:rPr>
-                <w:sz w:val="18"/>
-              </w:rPr>
               <w:t>62</w:t>
             </w:r>
           </w:p>
@@ -4139,9 +3207,6 @@
           </w:tcPr>
           <w:p>
             <w:r>
-              <w:rPr>
-                <w:sz w:val="18"/>
-              </w:rPr>
               <w:t>8</w:t>
             </w:r>
           </w:p>
@@ -4152,9 +3217,6 @@
           </w:tcPr>
           <w:p>
             <w:r>
-              <w:rPr>
-                <w:sz w:val="18"/>
-              </w:rPr>
               <w:t>S</w:t>
             </w:r>
           </w:p>
@@ -4165,9 +3227,6 @@
           </w:tcPr>
           <w:p>
             <w:r>
-              <w:rPr>
-                <w:sz w:val="18"/>
-              </w:rPr>
               <w:t>4</w:t>
             </w:r>
           </w:p>
@@ -4180,9 +3239,6 @@
           </w:tcPr>
           <w:p>
             <w:r>
-              <w:rPr>
-                <w:sz w:val="18"/>
-              </w:rPr>
               <w:t>40</w:t>
             </w:r>
           </w:p>
@@ -4193,9 +3249,6 @@
           </w:tcPr>
           <w:p>
             <w:r>
-              <w:rPr>
-                <w:sz w:val="18"/>
-              </w:rPr>
               <w:t>FP</w:t>
             </w:r>
           </w:p>
@@ -4206,9 +3259,6 @@
           </w:tcPr>
           <w:p>
             <w:r>
-              <w:rPr>
-                <w:sz w:val="18"/>
-              </w:rPr>
               <w:t>Ética General y Profesional</w:t>
             </w:r>
           </w:p>
@@ -4219,9 +3269,6 @@
           </w:tcPr>
           <w:p>
             <w:r>
-              <w:rPr>
-                <w:sz w:val="18"/>
-              </w:rPr>
               <w:t>56</w:t>
             </w:r>
           </w:p>
@@ -4232,9 +3279,6 @@
           </w:tcPr>
           <w:p>
             <w:r>
-              <w:rPr>
-                <w:sz w:val="18"/>
-              </w:rPr>
               <w:t>0</w:t>
             </w:r>
           </w:p>
@@ -4245,9 +3289,6 @@
           </w:tcPr>
           <w:p>
             <w:r>
-              <w:rPr>
-                <w:sz w:val="18"/>
-              </w:rPr>
               <w:t>S</w:t>
             </w:r>
           </w:p>
@@ -4258,9 +3299,6 @@
           </w:tcPr>
           <w:p>
             <w:r>
-              <w:rPr>
-                <w:sz w:val="18"/>
-              </w:rPr>
               <w:t>4</w:t>
             </w:r>
           </w:p>
@@ -4273,9 +3311,6 @@
           </w:tcPr>
           <w:p>
             <w:r>
-              <w:rPr>
-                <w:sz w:val="18"/>
-              </w:rPr>
               <w:t>41</w:t>
             </w:r>
           </w:p>
@@ -4286,9 +3321,6 @@
           </w:tcPr>
           <w:p>
             <w:r>
-              <w:rPr>
-                <w:sz w:val="18"/>
-              </w:rPr>
               <w:t>FCI</w:t>
             </w:r>
           </w:p>
@@ -4299,9 +3331,6 @@
           </w:tcPr>
           <w:p>
             <w:r>
-              <w:rPr>
-                <w:sz w:val="18"/>
-              </w:rPr>
               <w:t>Optativa II</w:t>
             </w:r>
           </w:p>
@@ -4312,9 +3341,6 @@
           </w:tcPr>
           <w:p>
             <w:r>
-              <w:rPr>
-                <w:sz w:val="18"/>
-              </w:rPr>
               <w:t>36</w:t>
             </w:r>
           </w:p>
@@ -4325,9 +3351,6 @@
           </w:tcPr>
           <w:p>
             <w:r>
-              <w:rPr>
-                <w:sz w:val="18"/>
-              </w:rPr>
               <w:t>0</w:t>
             </w:r>
           </w:p>
@@ -4338,9 +3361,6 @@
           </w:tcPr>
           <w:p>
             <w:r>
-              <w:rPr>
-                <w:sz w:val="18"/>
-              </w:rPr>
               <w:t>S</w:t>
             </w:r>
           </w:p>
@@ -4351,9 +3371,6 @@
           </w:tcPr>
           <w:p>
             <w:r>
-              <w:rPr>
-                <w:sz w:val="18"/>
-              </w:rPr>
               <w:t>4</w:t>
             </w:r>
           </w:p>
@@ -4366,9 +3383,6 @@
           </w:tcPr>
           <w:p>
             <w:r>
-              <w:rPr>
-                <w:sz w:val="18"/>
-              </w:rPr>
               <w:t>42</w:t>
             </w:r>
           </w:p>
@@ -4379,9 +3393,6 @@
           </w:tcPr>
           <w:p>
             <w:r>
-              <w:rPr>
-                <w:sz w:val="18"/>
-              </w:rPr>
               <w:t>FCI</w:t>
             </w:r>
           </w:p>
@@ -4392,9 +3403,6 @@
           </w:tcPr>
           <w:p>
             <w:r>
-              <w:rPr>
-                <w:sz w:val="18"/>
-              </w:rPr>
               <w:t>Taller de Reflexión II</w:t>
             </w:r>
           </w:p>
@@ -4405,9 +3413,6 @@
           </w:tcPr>
           <w:p>
             <w:r>
-              <w:rPr>
-                <w:sz w:val="18"/>
-              </w:rPr>
               <w:t>28</w:t>
             </w:r>
           </w:p>
@@ -4418,9 +3423,6 @@
           </w:tcPr>
           <w:p>
             <w:r>
-              <w:rPr>
-                <w:sz w:val="18"/>
-              </w:rPr>
               <w:t>0</w:t>
             </w:r>
           </w:p>
@@ -4431,9 +3433,6 @@
           </w:tcPr>
           <w:p>
             <w:r>
-              <w:rPr>
-                <w:sz w:val="18"/>
-              </w:rPr>
               <w:t>S</w:t>
             </w:r>
           </w:p>
@@ -4444,9 +3443,6 @@
           </w:tcPr>
           <w:p>
             <w:r>
-              <w:rPr>
-                <w:sz w:val="18"/>
-              </w:rPr>
               <w:t>4</w:t>
             </w:r>
           </w:p>
@@ -4488,10 +3484,6 @@
           </w:tcPr>
           <w:p>
             <w:r>
-              <w:rPr>
-                <w:b/>
-                <w:sz w:val="18"/>
-              </w:rPr>
               <w:t>Código</w:t>
             </w:r>
           </w:p>
@@ -4502,10 +3494,6 @@
           </w:tcPr>
           <w:p>
             <w:r>
-              <w:rPr>
-                <w:b/>
-                <w:sz w:val="18"/>
-              </w:rPr>
               <w:t>Área</w:t>
             </w:r>
           </w:p>
@@ -4516,10 +3504,6 @@
           </w:tcPr>
           <w:p>
             <w:r>
-              <w:rPr>
-                <w:b/>
-                <w:sz w:val="18"/>
-              </w:rPr>
               <w:t>Asignatura</w:t>
             </w:r>
           </w:p>
@@ -4530,10 +3514,6 @@
           </w:tcPr>
           <w:p>
             <w:r>
-              <w:rPr>
-                <w:b/>
-                <w:sz w:val="18"/>
-              </w:rPr>
               <w:t>H. teóricas</w:t>
             </w:r>
           </w:p>
@@ -4544,10 +3524,6 @@
           </w:tcPr>
           <w:p>
             <w:r>
-              <w:rPr>
-                <w:b/>
-                <w:sz w:val="18"/>
-              </w:rPr>
               <w:t>H. prácticas</w:t>
             </w:r>
           </w:p>
@@ -4558,10 +3534,6 @@
           </w:tcPr>
           <w:p>
             <w:r>
-              <w:rPr>
-                <w:b/>
-                <w:sz w:val="18"/>
-              </w:rPr>
               <w:t>Régimen</w:t>
             </w:r>
           </w:p>
@@ -4572,10 +3544,6 @@
           </w:tcPr>
           <w:p>
             <w:r>
-              <w:rPr>
-                <w:b/>
-                <w:sz w:val="18"/>
-              </w:rPr>
               <w:t>Año</w:t>
             </w:r>
           </w:p>
@@ -4588,9 +3556,6 @@
           </w:tcPr>
           <w:p>
             <w:r>
-              <w:rPr>
-                <w:sz w:val="18"/>
-              </w:rPr>
               <w:t>43</w:t>
             </w:r>
           </w:p>
@@ -4601,9 +3566,6 @@
           </w:tcPr>
           <w:p>
             <w:r>
-              <w:rPr>
-                <w:sz w:val="18"/>
-              </w:rPr>
               <w:t>FP</w:t>
             </w:r>
           </w:p>
@@ -4614,9 +3576,6 @@
           </w:tcPr>
           <w:p>
             <w:r>
-              <w:rPr>
-                <w:sz w:val="18"/>
-              </w:rPr>
               <w:t>Proceso Psicodiagnóstico</w:t>
             </w:r>
           </w:p>
@@ -4627,9 +3586,6 @@
           </w:tcPr>
           <w:p>
             <w:r>
-              <w:rPr>
-                <w:sz w:val="18"/>
-              </w:rPr>
               <w:t>60</w:t>
             </w:r>
           </w:p>
@@ -4640,9 +3596,6 @@
           </w:tcPr>
           <w:p>
             <w:r>
-              <w:rPr>
-                <w:sz w:val="18"/>
-              </w:rPr>
               <w:t>10</w:t>
             </w:r>
           </w:p>
@@ -4653,9 +3606,6 @@
           </w:tcPr>
           <w:p>
             <w:r>
-              <w:rPr>
-                <w:sz w:val="18"/>
-              </w:rPr>
               <w:t>A</w:t>
             </w:r>
           </w:p>
@@ -4666,9 +3616,6 @@
           </w:tcPr>
           <w:p>
             <w:r>
-              <w:rPr>
-                <w:sz w:val="18"/>
-              </w:rPr>
               <w:t>5</w:t>
             </w:r>
           </w:p>
@@ -4681,9 +3628,6 @@
           </w:tcPr>
           <w:p>
             <w:r>
-              <w:rPr>
-                <w:sz w:val="18"/>
-              </w:rPr>
               <w:t>44</w:t>
             </w:r>
           </w:p>
@@ -4694,9 +3638,6 @@
           </w:tcPr>
           <w:p>
             <w:r>
-              <w:rPr>
-                <w:sz w:val="18"/>
-              </w:rPr>
               <w:t>FP</w:t>
             </w:r>
           </w:p>
@@ -4707,9 +3648,6 @@
           </w:tcPr>
           <w:p>
             <w:r>
-              <w:rPr>
-                <w:sz w:val="18"/>
-              </w:rPr>
               <w:t>Psicología Jurídica</w:t>
             </w:r>
           </w:p>
@@ -4720,9 +3658,6 @@
           </w:tcPr>
           <w:p>
             <w:r>
-              <w:rPr>
-                <w:sz w:val="18"/>
-              </w:rPr>
               <w:t>74</w:t>
             </w:r>
           </w:p>
@@ -4733,9 +3668,6 @@
           </w:tcPr>
           <w:p>
             <w:r>
-              <w:rPr>
-                <w:sz w:val="18"/>
-              </w:rPr>
               <w:t>10</w:t>
             </w:r>
           </w:p>
@@ -4746,9 +3678,6 @@
           </w:tcPr>
           <w:p>
             <w:r>
-              <w:rPr>
-                <w:sz w:val="18"/>
-              </w:rPr>
               <w:t>S</w:t>
             </w:r>
           </w:p>
@@ -4759,9 +3688,6 @@
           </w:tcPr>
           <w:p>
             <w:r>
-              <w:rPr>
-                <w:sz w:val="18"/>
-              </w:rPr>
               <w:t>5</w:t>
             </w:r>
           </w:p>
@@ -4774,9 +3700,6 @@
           </w:tcPr>
           <w:p>
             <w:r>
-              <w:rPr>
-                <w:sz w:val="18"/>
-              </w:rPr>
               <w:t>45</w:t>
             </w:r>
           </w:p>
@@ -4787,9 +3710,6 @@
           </w:tcPr>
           <w:p>
             <w:r>
-              <w:rPr>
-                <w:sz w:val="18"/>
-              </w:rPr>
               <w:t>FP</w:t>
             </w:r>
           </w:p>
@@ -4800,9 +3720,6 @@
           </w:tcPr>
           <w:p>
             <w:r>
-              <w:rPr>
-                <w:sz w:val="18"/>
-              </w:rPr>
               <w:t>Psicología Laboral y Organizacional</w:t>
             </w:r>
           </w:p>
@@ -4813,9 +3730,6 @@
           </w:tcPr>
           <w:p>
             <w:r>
-              <w:rPr>
-                <w:sz w:val="18"/>
-              </w:rPr>
               <w:t>74</w:t>
             </w:r>
           </w:p>
@@ -4826,9 +3740,6 @@
           </w:tcPr>
           <w:p>
             <w:r>
-              <w:rPr>
-                <w:sz w:val="18"/>
-              </w:rPr>
               <w:t>10</w:t>
             </w:r>
           </w:p>
@@ -4839,9 +3750,6 @@
           </w:tcPr>
           <w:p>
             <w:r>
-              <w:rPr>
-                <w:sz w:val="18"/>
-              </w:rPr>
               <w:t>S</w:t>
             </w:r>
           </w:p>
@@ -4852,9 +3760,6 @@
           </w:tcPr>
           <w:p>
             <w:r>
-              <w:rPr>
-                <w:sz w:val="18"/>
-              </w:rPr>
               <w:t>5</w:t>
             </w:r>
           </w:p>
@@ -4867,9 +3772,6 @@
           </w:tcPr>
           <w:p>
             <w:r>
-              <w:rPr>
-                <w:sz w:val="18"/>
-              </w:rPr>
               <w:t>46</w:t>
             </w:r>
           </w:p>
@@ -4880,9 +3782,6 @@
           </w:tcPr>
           <w:p>
             <w:r>
-              <w:rPr>
-                <w:sz w:val="18"/>
-              </w:rPr>
               <w:t>FCI</w:t>
             </w:r>
           </w:p>
@@ -4893,9 +3792,6 @@
           </w:tcPr>
           <w:p>
             <w:r>
-              <w:rPr>
-                <w:sz w:val="18"/>
-              </w:rPr>
               <w:t>Optativa III</w:t>
             </w:r>
           </w:p>
@@ -4906,9 +3802,6 @@
           </w:tcPr>
           <w:p>
             <w:r>
-              <w:rPr>
-                <w:sz w:val="18"/>
-              </w:rPr>
               <w:t>36</w:t>
             </w:r>
           </w:p>
@@ -4919,9 +3812,6 @@
           </w:tcPr>
           <w:p>
             <w:r>
-              <w:rPr>
-                <w:sz w:val="18"/>
-              </w:rPr>
               <w:t>0</w:t>
             </w:r>
           </w:p>
@@ -4932,9 +3822,6 @@
           </w:tcPr>
           <w:p>
             <w:r>
-              <w:rPr>
-                <w:sz w:val="18"/>
-              </w:rPr>
               <w:t>S</w:t>
             </w:r>
           </w:p>
@@ -4945,9 +3832,6 @@
           </w:tcPr>
           <w:p>
             <w:r>
-              <w:rPr>
-                <w:sz w:val="18"/>
-              </w:rPr>
               <w:t>5</w:t>
             </w:r>
           </w:p>
@@ -4960,9 +3844,6 @@
           </w:tcPr>
           <w:p>
             <w:r>
-              <w:rPr>
-                <w:sz w:val="18"/>
-              </w:rPr>
               <w:t>47</w:t>
             </w:r>
           </w:p>
@@ -4973,9 +3854,6 @@
           </w:tcPr>
           <w:p>
             <w:r>
-              <w:rPr>
-                <w:sz w:val="18"/>
-              </w:rPr>
               <w:t>FCI</w:t>
             </w:r>
           </w:p>
@@ -4986,9 +3864,6 @@
           </w:tcPr>
           <w:p>
             <w:r>
-              <w:rPr>
-                <w:sz w:val="18"/>
-              </w:rPr>
               <w:t>Optativa IV</w:t>
             </w:r>
           </w:p>
@@ -4999,9 +3874,6 @@
           </w:tcPr>
           <w:p>
             <w:r>
-              <w:rPr>
-                <w:sz w:val="18"/>
-              </w:rPr>
               <w:t>36</w:t>
             </w:r>
           </w:p>
@@ -5012,9 +3884,6 @@
           </w:tcPr>
           <w:p>
             <w:r>
-              <w:rPr>
-                <w:sz w:val="18"/>
-              </w:rPr>
               <w:t>0</w:t>
             </w:r>
           </w:p>
@@ -5025,9 +3894,6 @@
           </w:tcPr>
           <w:p>
             <w:r>
-              <w:rPr>
-                <w:sz w:val="18"/>
-              </w:rPr>
               <w:t>S</w:t>
             </w:r>
           </w:p>
@@ -5038,9 +3904,6 @@
           </w:tcPr>
           <w:p>
             <w:r>
-              <w:rPr>
-                <w:sz w:val="18"/>
-              </w:rPr>
               <w:t>5</w:t>
             </w:r>
           </w:p>
@@ -5053,9 +3916,6 @@
           </w:tcPr>
           <w:p>
             <w:r>
-              <w:rPr>
-                <w:sz w:val="18"/>
-              </w:rPr>
               <w:t>48</w:t>
             </w:r>
           </w:p>
@@ -5066,9 +3926,6 @@
           </w:tcPr>
           <w:p>
             <w:r>
-              <w:rPr>
-                <w:sz w:val="18"/>
-              </w:rPr>
               <w:t>FCI</w:t>
             </w:r>
           </w:p>
@@ -5079,9 +3936,6 @@
           </w:tcPr>
           <w:p>
             <w:r>
-              <w:rPr>
-                <w:sz w:val="18"/>
-              </w:rPr>
               <w:t>Taller de Reflexión III</w:t>
             </w:r>
           </w:p>
@@ -5092,9 +3946,6 @@
           </w:tcPr>
           <w:p>
             <w:r>
-              <w:rPr>
-                <w:sz w:val="18"/>
-              </w:rPr>
               <w:t>28</w:t>
             </w:r>
           </w:p>
@@ -5105,9 +3956,6 @@
           </w:tcPr>
           <w:p>
             <w:r>
-              <w:rPr>
-                <w:sz w:val="18"/>
-              </w:rPr>
               <w:t>0</w:t>
             </w:r>
           </w:p>
@@ -5118,9 +3966,6 @@
           </w:tcPr>
           <w:p>
             <w:r>
-              <w:rPr>
-                <w:sz w:val="18"/>
-              </w:rPr>
               <w:t>S</w:t>
             </w:r>
           </w:p>
@@ -5131,9 +3976,6 @@
           </w:tcPr>
           <w:p>
             <w:r>
-              <w:rPr>
-                <w:sz w:val="18"/>
-              </w:rPr>
               <w:t>5</w:t>
             </w:r>
           </w:p>
@@ -5146,9 +3988,6 @@
           </w:tcPr>
           <w:p>
             <w:r>
-              <w:rPr>
-                <w:sz w:val="18"/>
-              </w:rPr>
               <w:t>49</w:t>
             </w:r>
           </w:p>
@@ -5159,9 +3998,6 @@
           </w:tcPr>
           <w:p>
             <w:r>
-              <w:rPr>
-                <w:sz w:val="18"/>
-              </w:rPr>
               <w:t>FCI</w:t>
             </w:r>
           </w:p>
@@ -5172,9 +4008,6 @@
           </w:tcPr>
           <w:p>
             <w:r>
-              <w:rPr>
-                <w:sz w:val="18"/>
-              </w:rPr>
               <w:t>Doctrina Social de la Iglesia</w:t>
             </w:r>
           </w:p>
@@ -5185,9 +4018,6 @@
           </w:tcPr>
           <w:p>
             <w:r>
-              <w:rPr>
-                <w:sz w:val="18"/>
-              </w:rPr>
               <w:t>42</w:t>
             </w:r>
           </w:p>
@@ -5198,9 +4028,6 @@
           </w:tcPr>
           <w:p>
             <w:r>
-              <w:rPr>
-                <w:sz w:val="18"/>
-              </w:rPr>
               <w:t>0</w:t>
             </w:r>
           </w:p>
@@ -5211,9 +4038,6 @@
           </w:tcPr>
           <w:p>
             <w:r>
-              <w:rPr>
-                <w:sz w:val="18"/>
-              </w:rPr>
               <w:t>S</w:t>
             </w:r>
           </w:p>
@@ -5224,9 +4048,150 @@
           </w:tcPr>
           <w:p>
             <w:r>
-              <w:rPr>
-                <w:sz w:val="18"/>
-              </w:rPr>
+              <w:t>5</w:t>
+            </w:r>
+          </w:p>
+        </w:tc>
+      </w:tr>
+      <w:tr>
+        <w:tc>
+          <w:tcPr>
+            <w:tcW w:type="dxa" w:w="1506"/>
+          </w:tcPr>
+          <w:p>
+            <w:r>
+              <w:t>50</w:t>
+            </w:r>
+          </w:p>
+        </w:tc>
+        <w:tc>
+          <w:tcPr>
+            <w:tcW w:type="dxa" w:w="1506"/>
+          </w:tcPr>
+          <w:p>
+            <w:r>
+              <w:t>FP</w:t>
+            </w:r>
+          </w:p>
+        </w:tc>
+        <w:tc>
+          <w:tcPr>
+            <w:tcW w:type="dxa" w:w="1506"/>
+          </w:tcPr>
+          <w:p>
+            <w:r>
+              <w:t>Práctica Profesional Supervisada (PPS)</w:t>
+            </w:r>
+          </w:p>
+        </w:tc>
+        <w:tc>
+          <w:tcPr>
+            <w:tcW w:type="dxa" w:w="1506"/>
+          </w:tcPr>
+          <w:p>
+            <w:r>
+              <w:t>30</w:t>
+            </w:r>
+          </w:p>
+        </w:tc>
+        <w:tc>
+          <w:tcPr>
+            <w:tcW w:type="dxa" w:w="1506"/>
+          </w:tcPr>
+          <w:p>
+            <w:r>
+              <w:t>250</w:t>
+            </w:r>
+          </w:p>
+        </w:tc>
+        <w:tc>
+          <w:tcPr>
+            <w:tcW w:type="dxa" w:w="1506"/>
+          </w:tcPr>
+          <w:p>
+            <w:r>
+              <w:t>A</w:t>
+            </w:r>
+          </w:p>
+        </w:tc>
+        <w:tc>
+          <w:tcPr>
+            <w:tcW w:type="dxa" w:w="1506"/>
+          </w:tcPr>
+          <w:p>
+            <w:r>
+              <w:t>5</w:t>
+            </w:r>
+          </w:p>
+        </w:tc>
+      </w:tr>
+      <w:tr>
+        <w:tc>
+          <w:tcPr>
+            <w:tcW w:type="dxa" w:w="1506"/>
+          </w:tcPr>
+          <w:p>
+            <w:r>
+              <w:t>51</w:t>
+            </w:r>
+          </w:p>
+        </w:tc>
+        <w:tc>
+          <w:tcPr>
+            <w:tcW w:type="dxa" w:w="1506"/>
+          </w:tcPr>
+          <w:p>
+            <w:r>
+              <w:t>FP</w:t>
+            </w:r>
+          </w:p>
+        </w:tc>
+        <w:tc>
+          <w:tcPr>
+            <w:tcW w:type="dxa" w:w="1506"/>
+          </w:tcPr>
+          <w:p>
+            <w:r>
+              <w:t>Trabajo Integrador Final (TIF)</w:t>
+            </w:r>
+          </w:p>
+        </w:tc>
+        <w:tc>
+          <w:tcPr>
+            <w:tcW w:type="dxa" w:w="1506"/>
+          </w:tcPr>
+          <w:p>
+            <w:r>
+              <w:t>50</w:t>
+            </w:r>
+          </w:p>
+        </w:tc>
+        <w:tc>
+          <w:tcPr>
+            <w:tcW w:type="dxa" w:w="1506"/>
+          </w:tcPr>
+          <w:p>
+            <w:r>
+              <w:t>0</w:t>
+            </w:r>
+          </w:p>
+        </w:tc>
+        <w:tc>
+          <w:tcPr>
+            <w:tcW w:type="dxa" w:w="1506"/>
+          </w:tcPr>
+          <w:p>
+            <w:r>
+              <w:t>A</w:t>
+            </w:r>
+          </w:p>
+        </w:tc>
+        <w:tc>
+          <w:tcPr>
+            <w:tcW w:type="dxa" w:w="1506"/>
+          </w:tcPr>
+          <w:p>
+            <w:r>
               <w:t>5</w:t>
             </w:r>
           </w:p>
@@ -5235,350 +4200,12 @@
     </w:tbl>
     <w:p>
       <w:r>
-        <w:t>Total 5° año: 350 h teóricas + 30 h prácticas = 380 h</w:t>
-      </w:r>
-    </w:p>
-    <w:p>
-      <w:pPr>
-        <w:pStyle w:val="Heading2"/>
-      </w:pPr>
-      <w:r>
-        <w:t>6° AÑO</w:t>
-      </w:r>
-    </w:p>
-    <w:tbl>
-      <w:tblPr>
-        <w:tblStyle w:val="TableGrid"/>
-        <w:tblW w:type="auto" w:w="0"/>
-        <w:tblLook w:firstColumn="1" w:firstRow="1" w:lastColumn="0" w:lastRow="0" w:noHBand="0" w:noVBand="1" w:val="04A0"/>
-      </w:tblPr>
-      <w:tblGrid>
-        <w:gridCol w:w="1506"/>
-        <w:gridCol w:w="1506"/>
-        <w:gridCol w:w="1506"/>
-        <w:gridCol w:w="1506"/>
-        <w:gridCol w:w="1506"/>
-        <w:gridCol w:w="1506"/>
-        <w:gridCol w:w="1506"/>
-      </w:tblGrid>
-      <w:tr>
-        <w:tc>
-          <w:tcPr>
-            <w:tcW w:type="dxa" w:w="1506"/>
-          </w:tcPr>
-          <w:p>
-            <w:r>
-              <w:rPr>
-                <w:b/>
-                <w:sz w:val="18"/>
-              </w:rPr>
-              <w:t>Código</w:t>
-            </w:r>
-          </w:p>
-        </w:tc>
-        <w:tc>
-          <w:tcPr>
-            <w:tcW w:type="dxa" w:w="1506"/>
-          </w:tcPr>
-          <w:p>
-            <w:r>
-              <w:rPr>
-                <w:b/>
-                <w:sz w:val="18"/>
-              </w:rPr>
-              <w:t>Área</w:t>
-            </w:r>
-          </w:p>
-        </w:tc>
-        <w:tc>
-          <w:tcPr>
-            <w:tcW w:type="dxa" w:w="1506"/>
-          </w:tcPr>
-          <w:p>
-            <w:r>
-              <w:rPr>
-                <w:b/>
-                <w:sz w:val="18"/>
-              </w:rPr>
-              <w:t>Asignatura</w:t>
-            </w:r>
-          </w:p>
-        </w:tc>
-        <w:tc>
-          <w:tcPr>
-            <w:tcW w:type="dxa" w:w="1506"/>
-          </w:tcPr>
-          <w:p>
-            <w:r>
-              <w:rPr>
-                <w:b/>
-                <w:sz w:val="18"/>
-              </w:rPr>
-              <w:t>H. teóricas</w:t>
-            </w:r>
-          </w:p>
-        </w:tc>
-        <w:tc>
-          <w:tcPr>
-            <w:tcW w:type="dxa" w:w="1506"/>
-          </w:tcPr>
-          <w:p>
-            <w:r>
-              <w:rPr>
-                <w:b/>
-                <w:sz w:val="18"/>
-              </w:rPr>
-              <w:t>H. prácticas</w:t>
-            </w:r>
-          </w:p>
-        </w:tc>
-        <w:tc>
-          <w:tcPr>
-            <w:tcW w:type="dxa" w:w="1506"/>
-          </w:tcPr>
-          <w:p>
-            <w:r>
-              <w:rPr>
-                <w:b/>
-                <w:sz w:val="18"/>
-              </w:rPr>
-              <w:t>Régimen</w:t>
-            </w:r>
-          </w:p>
-        </w:tc>
-        <w:tc>
-          <w:tcPr>
-            <w:tcW w:type="dxa" w:w="1506"/>
-          </w:tcPr>
-          <w:p>
-            <w:r>
-              <w:rPr>
-                <w:b/>
-                <w:sz w:val="18"/>
-              </w:rPr>
-              <w:t>Año</w:t>
-            </w:r>
-          </w:p>
-        </w:tc>
-      </w:tr>
-      <w:tr>
-        <w:tc>
-          <w:tcPr>
-            <w:tcW w:type="dxa" w:w="1506"/>
-          </w:tcPr>
-          <w:p>
-            <w:r>
-              <w:rPr>
-                <w:sz w:val="18"/>
-              </w:rPr>
-              <w:t>50</w:t>
-            </w:r>
-          </w:p>
-        </w:tc>
-        <w:tc>
-          <w:tcPr>
-            <w:tcW w:type="dxa" w:w="1506"/>
-          </w:tcPr>
-          <w:p>
-            <w:r>
-              <w:rPr>
-                <w:sz w:val="18"/>
-              </w:rPr>
-              <w:t>FP</w:t>
-            </w:r>
-          </w:p>
-        </w:tc>
-        <w:tc>
-          <w:tcPr>
-            <w:tcW w:type="dxa" w:w="1506"/>
-          </w:tcPr>
-          <w:p>
-            <w:r>
-              <w:rPr>
-                <w:sz w:val="18"/>
-              </w:rPr>
-              <w:t>Práctica Profesional Supervisada (PPS)</w:t>
-            </w:r>
-          </w:p>
-        </w:tc>
-        <w:tc>
-          <w:tcPr>
-            <w:tcW w:type="dxa" w:w="1506"/>
-          </w:tcPr>
-          <w:p>
-            <w:r>
-              <w:rPr>
-                <w:sz w:val="18"/>
-              </w:rPr>
-              <w:t>30</w:t>
-            </w:r>
-          </w:p>
-        </w:tc>
-        <w:tc>
-          <w:tcPr>
-            <w:tcW w:type="dxa" w:w="1506"/>
-          </w:tcPr>
-          <w:p>
-            <w:r>
-              <w:rPr>
-                <w:sz w:val="18"/>
-              </w:rPr>
-              <w:t>250</w:t>
-            </w:r>
-          </w:p>
-        </w:tc>
-        <w:tc>
-          <w:tcPr>
-            <w:tcW w:type="dxa" w:w="1506"/>
-          </w:tcPr>
-          <w:p>
-            <w:r>
-              <w:rPr>
-                <w:sz w:val="18"/>
-              </w:rPr>
-              <w:t>A</w:t>
-            </w:r>
-          </w:p>
-        </w:tc>
-        <w:tc>
-          <w:tcPr>
-            <w:tcW w:type="dxa" w:w="1506"/>
-          </w:tcPr>
-          <w:p>
-            <w:r>
-              <w:rPr>
-                <w:sz w:val="18"/>
-              </w:rPr>
-              <w:t>6</w:t>
-            </w:r>
-          </w:p>
-        </w:tc>
-      </w:tr>
-      <w:tr>
-        <w:tc>
-          <w:tcPr>
-            <w:tcW w:type="dxa" w:w="1506"/>
-          </w:tcPr>
-          <w:p>
-            <w:r>
-              <w:rPr>
-                <w:sz w:val="18"/>
-              </w:rPr>
-              <w:t>51</w:t>
-            </w:r>
-          </w:p>
-        </w:tc>
-        <w:tc>
-          <w:tcPr>
-            <w:tcW w:type="dxa" w:w="1506"/>
-          </w:tcPr>
-          <w:p>
-            <w:r>
-              <w:rPr>
-                <w:sz w:val="18"/>
-              </w:rPr>
-              <w:t>FP</w:t>
-            </w:r>
-          </w:p>
-        </w:tc>
-        <w:tc>
-          <w:tcPr>
-            <w:tcW w:type="dxa" w:w="1506"/>
-          </w:tcPr>
-          <w:p>
-            <w:r>
-              <w:rPr>
-                <w:sz w:val="18"/>
-              </w:rPr>
-              <w:t>Trabajo Integrador Final (TIF)</w:t>
-            </w:r>
-          </w:p>
-        </w:tc>
-        <w:tc>
-          <w:tcPr>
-            <w:tcW w:type="dxa" w:w="1506"/>
-          </w:tcPr>
-          <w:p>
-            <w:r>
-              <w:rPr>
-                <w:sz w:val="18"/>
-              </w:rPr>
-              <w:t>50</w:t>
-            </w:r>
-          </w:p>
-        </w:tc>
-        <w:tc>
-          <w:tcPr>
-            <w:tcW w:type="dxa" w:w="1506"/>
-          </w:tcPr>
-          <w:p>
-            <w:r>
-              <w:rPr>
-                <w:sz w:val="18"/>
-              </w:rPr>
-              <w:t>0</w:t>
-            </w:r>
-          </w:p>
-        </w:tc>
-        <w:tc>
-          <w:tcPr>
-            <w:tcW w:type="dxa" w:w="1506"/>
-          </w:tcPr>
-          <w:p>
-            <w:r>
-              <w:rPr>
-                <w:sz w:val="18"/>
-              </w:rPr>
-              <w:t>A</w:t>
-            </w:r>
-          </w:p>
-        </w:tc>
-        <w:tc>
-          <w:tcPr>
-            <w:tcW w:type="dxa" w:w="1506"/>
-          </w:tcPr>
-          <w:p>
-            <w:r>
-              <w:rPr>
-                <w:sz w:val="18"/>
-              </w:rPr>
-              <w:t>6</w:t>
-            </w:r>
-          </w:p>
-        </w:tc>
-      </w:tr>
-    </w:tbl>
-    <w:p>
-      <w:r>
-        <w:t>Total 6° año: 80 h teóricas + 250 h prácticas = 330 h</w:t>
-      </w:r>
-    </w:p>
-    <w:p>
-      <w:pPr>
-        <w:pStyle w:val="Heading2"/>
-      </w:pPr>
-      <w:r>
-        <w:t>Totales del plan</w:t>
+        <w:t>Total 5° año: 430 h teóricas + 280 h prácticas = 710 h</w:t>
       </w:r>
     </w:p>
     <w:p>
       <w:r>
-        <w:t>Horas teóricas: 3160</w:t>
-      </w:r>
-    </w:p>
-    <w:p>
-      <w:r>
-        <w:t>Horas prácticas: 500</w:t>
-      </w:r>
-    </w:p>
-    <w:p>
-      <w:r>
-        <w:t>Horas de interacción (total): 3660</w:t>
-      </w:r>
-    </w:p>
-    <w:p>
-      <w:r>
-        <w:t>Nota: algunas horas de 4° año están marcadas como estimadas en la fuente digitalizada; revisar ante el original Res. 1098-CS-2013 si se requiere exactitud notarial.</w:t>
+        <w:t>Interacción pedagógica (total): 3660</w:t>
       </w:r>
     </w:p>
     <w:sectPr>

</xml_diff>